<commit_message>
Updates to user manual
</commit_message>
<xml_diff>
--- a/TLC Awards Parser Manual.docx
+++ b/TLC Awards Parser Manual.docx
@@ -28,8 +28,13 @@
         <w:pStyle w:val="Subtitle"/>
         <w:jc w:val="center"/>
       </w:pPr>
-      <w:r>
-        <w:t>Troopmaster, AL-1613</w:t>
+      <w:proofErr w:type="spellStart"/>
+      <w:r>
+        <w:t>Troopmaster</w:t>
+      </w:r>
+      <w:proofErr w:type="spellEnd"/>
+      <w:r>
+        <w:t>, AL-1613</w:t>
       </w:r>
     </w:p>
     <w:p>
@@ -111,7 +116,15 @@
     </w:p>
     <w:p>
       <w:r>
-        <w:t xml:space="preserve">AL-1613 has refined our COH program quite a bit, as we have an associated AHG troop and try to limit our Trail Life awards program to about 40 minutes. We have more than 60 Trailmen in our troop as of the time of </w:t>
+        <w:t xml:space="preserve">AL-1613 has refined our COH program quite a bit, as we have an associated AHG troop and try to limit our Trail Life awards program to about 40 minutes. We have more than 60 </w:t>
+      </w:r>
+      <w:proofErr w:type="spellStart"/>
+      <w:r>
+        <w:t>Trailmen</w:t>
+      </w:r>
+      <w:proofErr w:type="spellEnd"/>
+      <w:r>
+        <w:t xml:space="preserve"> in our troop as of the time of </w:t>
       </w:r>
       <w:r>
         <w:t>the 0.2 release. As such, we have trimmed out some of the details that other troops may prefer to include. We also use our COH program as a means of introducing the troop and the TL program to visitors present to support family members that are unfamiliar with the program.</w:t>
@@ -123,18 +136,50 @@
         <w:t>During our awards program, e</w:t>
       </w:r>
       <w:r>
-        <w:t xml:space="preserve">ach Trailman receives a small baggie containing all his awards (WalMart snack bags are perfect). </w:t>
+        <w:t xml:space="preserve">ach </w:t>
+      </w:r>
+      <w:proofErr w:type="spellStart"/>
+      <w:r>
+        <w:t>Trailman</w:t>
+      </w:r>
+      <w:proofErr w:type="spellEnd"/>
+      <w:r>
+        <w:t xml:space="preserve"> receives a small baggie containing all his awards (</w:t>
+      </w:r>
+      <w:proofErr w:type="spellStart"/>
+      <w:r>
+        <w:t>WalMart</w:t>
+      </w:r>
+      <w:proofErr w:type="spellEnd"/>
+      <w:r>
+        <w:t xml:space="preserve"> snack bags are perfect). </w:t>
       </w:r>
       <w:r>
         <w:t>The baggie also includes a list of every award he is to receive at the COH for reference</w:t>
       </w:r>
       <w:r>
-        <w:t>. We decided through experience to not hand out the baggies to the Woodlands Trailmen until after the ceremony. They had a tendency to dump out the awards as soon as they sat down and start playing with them during the rest of the ceremony. Instead, we announce the awards and have them find their Trail Guide immediately after the ceremony to receive their awards.</w:t>
-      </w:r>
-    </w:p>
-    <w:p>
-      <w:r>
-        <w:t>Navigators and Adventurers receive a baggie with all their awards when their names are called. This currently includes the ranks and special awards, though they are called up again later to explicitly recognize ranks, Worthy Life, and capstone awards. The only extra item handed out during those times of recognition are the standards, which are given to the new Able Trailmen. If you have more time available during your ceremony, you may wish to pin on Worthy Life ribbons, or attach new rank badges during the time of recognition.</w:t>
+        <w:t xml:space="preserve">. We decided through experience to not hand out the baggies to the Woodlands </w:t>
+      </w:r>
+      <w:proofErr w:type="spellStart"/>
+      <w:r>
+        <w:t>Trailmen</w:t>
+      </w:r>
+      <w:proofErr w:type="spellEnd"/>
+      <w:r>
+        <w:t xml:space="preserve"> until after the ceremony. They had a tendency to dump out the awards as soon as they sat down and start playing with them during the rest of the ceremony. Instead, we announce the awards and have them find their Trail Guide immediately after the ceremony to receive their awards.</w:t>
+      </w:r>
+    </w:p>
+    <w:p>
+      <w:r>
+        <w:t xml:space="preserve">Navigators and Adventurers receive a baggie with all their awards when their names are called. This currently includes the ranks and special awards, though they are called up again later to explicitly recognize ranks, Worthy Life, and capstone awards. The only extra item handed out during those times of recognition are the standards, which are given to the new Able </w:t>
+      </w:r>
+      <w:proofErr w:type="spellStart"/>
+      <w:r>
+        <w:t>Trailmen</w:t>
+      </w:r>
+      <w:proofErr w:type="spellEnd"/>
+      <w:r>
+        <w:t>. If you have more time available during your ceremony, you may wish to pin on Worthy Life ribbons, or attach new rank badges during the time of recognition.</w:t>
       </w:r>
     </w:p>
     <w:p>
@@ -142,7 +187,23 @@
         <w:t xml:space="preserve">AL-1613 has also </w:t>
       </w:r>
       <w:r>
-        <w:t>opted not to read the name of every branch pin and sylvan star each Woodland Trailman earned. This got really tedious as all of our Woodland patrols work on the same frontier at the same time, so we'd be announcing "Heritage branch pin, Values branch pin, and Science and Technology Branch Pin" (or similar) 20+ times in a row. Instead, immediately before calling the patrols and names, the First Officer will state which branches the Woodland Trails patrols worked on in the last 6 months, and then will call names and announce the number of branch pins/sylvan stars earned. The specific names (and frontier colors) are listed on the award list in the Trailman's award bag.</w:t>
+        <w:t xml:space="preserve">opted not to read the name of every branch pin and sylvan star each Woodland </w:t>
+      </w:r>
+      <w:proofErr w:type="spellStart"/>
+      <w:r>
+        <w:t>Trailman</w:t>
+      </w:r>
+      <w:proofErr w:type="spellEnd"/>
+      <w:r>
+        <w:t xml:space="preserve"> earned. This got really tedious as all of our Woodland patrols work on the same frontier at the same time, so we'd be announcing "Heritage branch pin, Values branch pin, and Science and Technology Branch Pin" (or similar) 20+ times in a row. Instead, immediately before calling the patrols and names, the First Officer will state which branches the Woodland Trails patrols worked on in the last 6 months, and then will call names and announce the number of branch pins/sylvan stars earned. The specific names (and frontier colors) are listed on the award list in the </w:t>
+      </w:r>
+      <w:proofErr w:type="spellStart"/>
+      <w:r>
+        <w:t>Trailman's</w:t>
+      </w:r>
+      <w:proofErr w:type="spellEnd"/>
+      <w:r>
+        <w:t xml:space="preserve"> award bag.</w:t>
       </w:r>
     </w:p>
     <w:p>
@@ -174,7 +235,23 @@
     </w:p>
     <w:p>
       <w:r>
-        <w:t xml:space="preserve">For the Navigators and Adventurers, we call them up by program and announce the Trail badges, Elective badges, and Service stars earned by each Trailman. Next we call up Trailmen </w:t>
+        <w:t xml:space="preserve">For the Navigators and Adventurers, we call them up by program and announce the Trail badges, Elective badges, and Service stars earned by each </w:t>
+      </w:r>
+      <w:proofErr w:type="spellStart"/>
+      <w:r>
+        <w:t>Trailman</w:t>
+      </w:r>
+      <w:proofErr w:type="spellEnd"/>
+      <w:r>
+        <w:t xml:space="preserve">. Next we call up </w:t>
+      </w:r>
+      <w:proofErr w:type="spellStart"/>
+      <w:r>
+        <w:t>Trailmen</w:t>
+      </w:r>
+      <w:proofErr w:type="spellEnd"/>
+      <w:r>
+        <w:t xml:space="preserve"> </w:t>
       </w:r>
       <w:r>
         <w:lastRenderedPageBreak/>
@@ -183,10 +260,50 @@
     </w:p>
     <w:p>
       <w:r>
-        <w:t xml:space="preserve">During the May COH, we announce promotion to the next program level. Our troop supplies shoulder loops for the Trailmen, and we have </w:t>
-      </w:r>
-      <w:r>
-        <w:t>the Adventurers change out the shoulder loops for promoting Trailmen during the ceremony. To facilitate this, we start with Navigators promoting to Adventurers and work our way down. This is because shoulder loops will be passed on to new Trailmen. If your troop prefers to allow each Trailman to keep his old shoulder loops, you could just hand them to the Trailman at that time and place new loops on his shoulders.</w:t>
+        <w:t xml:space="preserve">During the May COH, we announce promotion to the next program level. Our troop supplies shoulder loops for the </w:t>
+      </w:r>
+      <w:proofErr w:type="spellStart"/>
+      <w:r>
+        <w:t>Trailmen</w:t>
+      </w:r>
+      <w:proofErr w:type="spellEnd"/>
+      <w:r>
+        <w:t xml:space="preserve">, and we have </w:t>
+      </w:r>
+      <w:r>
+        <w:t xml:space="preserve">the Adventurers change out the shoulder loops for promoting </w:t>
+      </w:r>
+      <w:proofErr w:type="spellStart"/>
+      <w:r>
+        <w:t>Trailmen</w:t>
+      </w:r>
+      <w:proofErr w:type="spellEnd"/>
+      <w:r>
+        <w:t xml:space="preserve"> during the ceremony. To facilitate this, we start with Navigators promoting to Adventurers and work our way down. This is because shoulder loops will be passed on to new </w:t>
+      </w:r>
+      <w:proofErr w:type="spellStart"/>
+      <w:r>
+        <w:t>Trailmen</w:t>
+      </w:r>
+      <w:proofErr w:type="spellEnd"/>
+      <w:r>
+        <w:t xml:space="preserve">. If your troop prefers to allow each </w:t>
+      </w:r>
+      <w:proofErr w:type="spellStart"/>
+      <w:r>
+        <w:t>Trailman</w:t>
+      </w:r>
+      <w:proofErr w:type="spellEnd"/>
+      <w:r>
+        <w:t xml:space="preserve"> to keep his old shoulder loops, you could just hand them to the </w:t>
+      </w:r>
+      <w:proofErr w:type="spellStart"/>
+      <w:r>
+        <w:t>Trailman</w:t>
+      </w:r>
+      <w:proofErr w:type="spellEnd"/>
+      <w:r>
+        <w:t xml:space="preserve"> at that time and place new loops on his shoulders.</w:t>
       </w:r>
     </w:p>
     <w:p>
@@ -196,7 +313,15 @@
     </w:p>
     <w:p>
       <w:r>
-        <w:t>We conclude the ceremony by announcing new Trailmen leadership roles in the troop, followed by any changes in adult leaders</w:t>
+        <w:t xml:space="preserve">We conclude the ceremony by announcing new </w:t>
+      </w:r>
+      <w:proofErr w:type="spellStart"/>
+      <w:r>
+        <w:t>Trailmen</w:t>
+      </w:r>
+      <w:proofErr w:type="spellEnd"/>
+      <w:r>
+        <w:t xml:space="preserve"> leadership roles in the troop, followed by any changes in adult leaders</w:t>
       </w:r>
       <w:r>
         <w:t>h</w:t>
@@ -207,7 +332,15 @@
     </w:p>
     <w:p>
       <w:r>
-        <w:t>Note that we hold a separate awards ceremony for the presentation of Freedom Awards. This allows the ceremony to be special and focused on just those Trailmen. We have included a very abbreviated version of the Freedom Award ceremony at the end of our normal COH for the purpose of presenting Freedom to an adult (who had earned Eagle Scout in the BSA program much earlier).</w:t>
+        <w:t xml:space="preserve">Note that we hold a separate awards ceremony for the presentation of Freedom Awards. This allows the ceremony to be special and focused on just those </w:t>
+      </w:r>
+      <w:proofErr w:type="spellStart"/>
+      <w:r>
+        <w:t>Trailmen</w:t>
+      </w:r>
+      <w:proofErr w:type="spellEnd"/>
+      <w:r>
+        <w:t>. We have included a very abbreviated version of the Freedom Award ceremony at the end of our normal COH for the purpose of presenting Freedom to an adult (who had earned Eagle Scout in the BSA program much earlier).</w:t>
       </w:r>
     </w:p>
     <w:p/>
@@ -243,7 +376,28 @@
     </w:p>
     <w:p>
       <w:r>
-        <w:t>In addition, as soon as I export the awards ceremony and parse it, I double check that the shopping list matches the TLC Awards Shopping List. I will then mark all awards in the COH Report as “Purchased.” Since our troop maintains an awards inventory, the literally have been purchased. More importantly, last-minute additions to the awards program will be easily noted and flagged. The parser program has the ability to add supplemental awards to the program, as discussed below. The key point is that using this capability will require adhering to our interpretation of the “Purchased” label.</w:t>
+        <w:t xml:space="preserve">In addition, as soon as I export the awards ceremony and parse it, I double check that the shopping list matches the TLC Awards Shopping List. I will then mark all awards in the COH Report as “Purchased.” Since our troop maintains an awards inventory, the literally have been purchased. More importantly, last-minute additions to the awards program will be easily noted and flagged. The parser program has the ability to add supplemental awards to the program, as discussed </w:t>
+      </w:r>
+      <w:r>
+        <w:t xml:space="preserve">in section </w:t>
+      </w:r>
+      <w:r>
+        <w:fldChar w:fldCharType="begin"/>
+      </w:r>
+      <w:r>
+        <w:instrText xml:space="preserve"> REF _Ref228486692 \r \h </w:instrText>
+      </w:r>
+      <w:r>
+        <w:fldChar w:fldCharType="separate"/>
+      </w:r>
+      <w:r>
+        <w:t>3.6</w:t>
+      </w:r>
+      <w:r>
+        <w:fldChar w:fldCharType="end"/>
+      </w:r>
+      <w:r>
+        <w:t>. The key point is that using this capability will require adhering to our interpretation of the “Purchased” label.</w:t>
       </w:r>
     </w:p>
     <w:p>
@@ -267,6 +421,386 @@
         <w:t xml:space="preserve"> By default, it should offer a filename of something like “Court of Honor Report.htm”. It is worth creating a new folder on your computer to store all the COH files (e.g. “May2026_COH”), and save this file into that folder. You may also wish to save off the Awards Shopping List from TLC to the same folder as a reference.</w:t>
       </w:r>
     </w:p>
+    <w:p>
+      <w:pPr>
+        <w:pStyle w:val="Heading2"/>
+      </w:pPr>
+      <w:r>
+        <w:t>Running the Parser Program</w:t>
+      </w:r>
+    </w:p>
+    <w:p>
+      <w:r>
+        <w:t>Run parse_awards_data.exe. A file selector dialog will open up</w:t>
+      </w:r>
+      <w:r>
+        <w:t xml:space="preserve"> (see </w:t>
+      </w:r>
+      <w:r>
+        <w:fldChar w:fldCharType="begin"/>
+      </w:r>
+      <w:r>
+        <w:instrText xml:space="preserve"> REF _Ref228487420 \h </w:instrText>
+      </w:r>
+      <w:r>
+        <w:fldChar w:fldCharType="separate"/>
+      </w:r>
+      <w:r>
+        <w:t xml:space="preserve">Figure </w:t>
+      </w:r>
+      <w:r>
+        <w:rPr>
+          <w:noProof/>
+        </w:rPr>
+        <w:t>1</w:t>
+      </w:r>
+      <w:r>
+        <w:fldChar w:fldCharType="end"/>
+      </w:r>
+      <w:r>
+        <w:t>)</w:t>
+      </w:r>
+      <w:r>
+        <w:t>. Navigate to and select the Court of Honor Report html file generated in the previous step.</w:t>
+      </w:r>
+      <w:r>
+        <w:t xml:space="preserve"> The program will check the directory containing the COH report file for a file named “</w:t>
+      </w:r>
+      <w:r>
+        <w:t>TL_Awards_Parser_settings.xml</w:t>
+      </w:r>
+      <w:r>
+        <w:t>”. If it exists, it will be used to configure several parsing options (</w:t>
+      </w:r>
+      <w:r>
+        <w:t xml:space="preserve">described in section </w:t>
+      </w:r>
+      <w:r>
+        <w:fldChar w:fldCharType="begin"/>
+      </w:r>
+      <w:r>
+        <w:instrText xml:space="preserve"> REF _Ref228486710 \r \h </w:instrText>
+      </w:r>
+      <w:r>
+        <w:fldChar w:fldCharType="separate"/>
+      </w:r>
+      <w:r>
+        <w:t>3.5</w:t>
+      </w:r>
+      <w:r>
+        <w:fldChar w:fldCharType="end"/>
+      </w:r>
+      <w:r>
+        <w:t>)</w:t>
+      </w:r>
+      <w:r>
+        <w:t>. If the file is not found, default configurations will be used.</w:t>
+      </w:r>
+    </w:p>
+    <w:p>
+      <w:pPr>
+        <w:jc w:val="center"/>
+      </w:pPr>
+      <w:r>
+        <w:lastRenderedPageBreak/>
+        <w:drawing>
+          <wp:inline distT="0" distB="0" distL="0" distR="0" wp14:anchorId="6C5BB71C" wp14:editId="68B57597">
+            <wp:extent cx="5943600" cy="3333750"/>
+            <wp:effectExtent l="0" t="0" r="0" b="0"/>
+            <wp:docPr id="1458359331" name="Picture 1"/>
+            <wp:cNvGraphicFramePr>
+              <a:graphicFrameLocks xmlns:a="http://schemas.openxmlformats.org/drawingml/2006/main" noChangeAspect="1"/>
+            </wp:cNvGraphicFramePr>
+            <a:graphic xmlns:a="http://schemas.openxmlformats.org/drawingml/2006/main">
+              <a:graphicData uri="http://schemas.openxmlformats.org/drawingml/2006/picture">
+                <pic:pic xmlns:pic="http://schemas.openxmlformats.org/drawingml/2006/picture">
+                  <pic:nvPicPr>
+                    <pic:cNvPr id="1458359331" name=""/>
+                    <pic:cNvPicPr/>
+                  </pic:nvPicPr>
+                  <pic:blipFill>
+                    <a:blip r:embed="rId6"/>
+                    <a:stretch>
+                      <a:fillRect/>
+                    </a:stretch>
+                  </pic:blipFill>
+                  <pic:spPr>
+                    <a:xfrm>
+                      <a:off x="0" y="0"/>
+                      <a:ext cx="5943600" cy="3333750"/>
+                    </a:xfrm>
+                    <a:prstGeom prst="rect">
+                      <a:avLst/>
+                    </a:prstGeom>
+                  </pic:spPr>
+                </pic:pic>
+              </a:graphicData>
+            </a:graphic>
+          </wp:inline>
+        </w:drawing>
+      </w:r>
+    </w:p>
+    <w:p>
+      <w:pPr>
+        <w:pStyle w:val="Caption"/>
+      </w:pPr>
+      <w:bookmarkStart w:id="0" w:name="_Ref228487420"/>
+      <w:r>
+        <w:t xml:space="preserve">Figure </w:t>
+      </w:r>
+      <w:fldSimple w:instr=" SEQ Figure \* ARABIC ">
+        <w:r>
+          <w:rPr>
+            <w:noProof/>
+          </w:rPr>
+          <w:t>1</w:t>
+        </w:r>
+      </w:fldSimple>
+      <w:bookmarkEnd w:id="0"/>
+      <w:r>
+        <w:t>. Parser program file selector dialog box. Select the HTML format file saved from the TLC Court of Honor web page.</w:t>
+      </w:r>
+    </w:p>
+    <w:p>
+      <w:r>
+        <w:t xml:space="preserve">Apart from requesting an input file, the only other user interaction that may be needed during program execution occurs when a Navigator or Adventurer has earned a Design-Your-Own or TEAM elective badge. The program will open a window </w:t>
+      </w:r>
+      <w:r>
+        <w:t xml:space="preserve">(illustrated in </w:t>
+      </w:r>
+      <w:r>
+        <w:fldChar w:fldCharType="begin"/>
+      </w:r>
+      <w:r>
+        <w:instrText xml:space="preserve"> REF _Ref228487442 \h </w:instrText>
+      </w:r>
+      <w:r>
+        <w:fldChar w:fldCharType="separate"/>
+      </w:r>
+      <w:r>
+        <w:t xml:space="preserve">Figure </w:t>
+      </w:r>
+      <w:r>
+        <w:rPr>
+          <w:noProof/>
+        </w:rPr>
+        <w:t>2</w:t>
+      </w:r>
+      <w:r>
+        <w:fldChar w:fldCharType="end"/>
+      </w:r>
+      <w:r>
+        <w:t xml:space="preserve">) </w:t>
+      </w:r>
+      <w:r>
+        <w:t xml:space="preserve">noting the </w:t>
+      </w:r>
+      <w:proofErr w:type="spellStart"/>
+      <w:r>
+        <w:t>Trailman</w:t>
+      </w:r>
+      <w:proofErr w:type="spellEnd"/>
+      <w:r>
+        <w:t xml:space="preserve"> name and the date the badge was completed. It will request a name </w:t>
+      </w:r>
+      <w:r>
+        <w:t>for the badge that will be listed in the awards program. For example, custom badges completed either through the certification, analogy, CLEAR, or TEAM approach will show up in the COH report simply as a “Design Your Own Badge/TEAM Advancement”, and this feature allows those badges to be announced as “Birding”, “Kayaking”, “</w:t>
+      </w:r>
+      <w:r>
+        <w:t xml:space="preserve">Pickle Ball”, “Hammock Camping”, or whatever else the </w:t>
+      </w:r>
+      <w:proofErr w:type="spellStart"/>
+      <w:r>
+        <w:t>Trailmen</w:t>
+      </w:r>
+      <w:proofErr w:type="spellEnd"/>
+      <w:r>
+        <w:t xml:space="preserve"> come up with. Note also that the badge name may be explicitly specified in the settings file, as discussed </w:t>
+      </w:r>
+      <w:r>
+        <w:t xml:space="preserve">in section </w:t>
+      </w:r>
+      <w:r>
+        <w:fldChar w:fldCharType="begin"/>
+      </w:r>
+      <w:r>
+        <w:instrText xml:space="preserve"> REF _Ref228486710 \r \h </w:instrText>
+      </w:r>
+      <w:r>
+        <w:fldChar w:fldCharType="separate"/>
+      </w:r>
+      <w:r>
+        <w:t>3.5</w:t>
+      </w:r>
+      <w:r>
+        <w:fldChar w:fldCharType="end"/>
+      </w:r>
+      <w:r>
+        <w:t xml:space="preserve">. If a badge name is found in the settings file that matches the </w:t>
+      </w:r>
+      <w:proofErr w:type="spellStart"/>
+      <w:r>
+        <w:t>Trailman</w:t>
+      </w:r>
+      <w:proofErr w:type="spellEnd"/>
+      <w:r>
+        <w:t xml:space="preserve"> name and completion date of the requested badge, the name from the settings file will be used, and no dialog box will appear.</w:t>
+      </w:r>
+    </w:p>
+    <w:p>
+      <w:pPr>
+        <w:jc w:val="center"/>
+      </w:pPr>
+      <w:r>
+        <w:rPr>
+          <w:noProof/>
+        </w:rPr>
+        <w:drawing>
+          <wp:inline distT="0" distB="0" distL="0" distR="0" wp14:anchorId="406AE042" wp14:editId="599ED731">
+            <wp:extent cx="5124450" cy="1295400"/>
+            <wp:effectExtent l="0" t="0" r="0" b="0"/>
+            <wp:docPr id="920024160" name="Picture 1"/>
+            <wp:cNvGraphicFramePr>
+              <a:graphicFrameLocks xmlns:a="http://schemas.openxmlformats.org/drawingml/2006/main" noChangeAspect="1"/>
+            </wp:cNvGraphicFramePr>
+            <a:graphic xmlns:a="http://schemas.openxmlformats.org/drawingml/2006/main">
+              <a:graphicData uri="http://schemas.openxmlformats.org/drawingml/2006/picture">
+                <pic:pic xmlns:pic="http://schemas.openxmlformats.org/drawingml/2006/picture">
+                  <pic:nvPicPr>
+                    <pic:cNvPr id="0" name="Picture 1"/>
+                    <pic:cNvPicPr>
+                      <a:picLocks noChangeAspect="1" noChangeArrowheads="1"/>
+                    </pic:cNvPicPr>
+                  </pic:nvPicPr>
+                  <pic:blipFill>
+                    <a:blip r:embed="rId7">
+                      <a:extLst>
+                        <a:ext uri="{28A0092B-C50C-407E-A947-70E740481C1C}">
+                          <a14:useLocalDpi xmlns:a14="http://schemas.microsoft.com/office/drawing/2010/main" val="0"/>
+                        </a:ext>
+                      </a:extLst>
+                    </a:blip>
+                    <a:srcRect/>
+                    <a:stretch>
+                      <a:fillRect/>
+                    </a:stretch>
+                  </pic:blipFill>
+                  <pic:spPr bwMode="auto">
+                    <a:xfrm>
+                      <a:off x="0" y="0"/>
+                      <a:ext cx="5124450" cy="1295400"/>
+                    </a:xfrm>
+                    <a:prstGeom prst="rect">
+                      <a:avLst/>
+                    </a:prstGeom>
+                    <a:noFill/>
+                    <a:ln>
+                      <a:noFill/>
+                    </a:ln>
+                  </pic:spPr>
+                </pic:pic>
+              </a:graphicData>
+            </a:graphic>
+          </wp:inline>
+        </w:drawing>
+      </w:r>
+    </w:p>
+    <w:p>
+      <w:pPr>
+        <w:pStyle w:val="Caption"/>
+      </w:pPr>
+      <w:bookmarkStart w:id="1" w:name="_Ref228487442"/>
+      <w:r>
+        <w:t xml:space="preserve">Figure </w:t>
+      </w:r>
+      <w:fldSimple w:instr=" SEQ Figure \* ARABIC ">
+        <w:r>
+          <w:rPr>
+            <w:noProof/>
+          </w:rPr>
+          <w:t>2</w:t>
+        </w:r>
+      </w:fldSimple>
+      <w:bookmarkEnd w:id="1"/>
+      <w:r>
+        <w:t xml:space="preserve">. Custom badge name selection box. This specific badge was "Lifeguard" and was completed via the </w:t>
+      </w:r>
+      <w:r>
+        <w:rPr>
+          <w:noProof/>
+        </w:rPr>
+        <w:t>certification method.</w:t>
+      </w:r>
+    </w:p>
+    <w:p>
+      <w:r>
+        <w:lastRenderedPageBreak/>
+        <w:t xml:space="preserve">Once the program has completed parsing the file, it will generate several different output files, which are discussed in the next section. These files will all appear in the same directory as the COH report file. In addition, a file named </w:t>
+      </w:r>
+      <w:r>
+        <w:t>TL_Awards_Parser_settings.xml</w:t>
+      </w:r>
+      <w:r>
+        <w:t xml:space="preserve"> will be placed in the same directory. This settings file will contain all settings used during the parsing process, including the specified name of any custom elective badges. The copy of the settings file is intended to aid in recreation of output files if something needs to be changed, including additional awards being added in TLC.</w:t>
+      </w:r>
+    </w:p>
+    <w:p>
+      <w:r>
+        <w:t xml:space="preserve">After generating the output files, it is useful to compare the generated shopping list Excel file (discussed in the next section) to the TLC Shopping List report. If both lists match, the recommended practice is to mark all awards in TLC as “Purchased”. If additional awards are added to TLC subsequent to generating the report and before the COH date, they will be clearly identifiable, as they will be the only ones not marked as Purchased. If desired, the parser program can be configured to combine these additional awards with the </w:t>
+      </w:r>
+      <w:r>
+        <w:t xml:space="preserve">initial report to create a single combined awards program. This process is described in section </w:t>
+      </w:r>
+      <w:r>
+        <w:fldChar w:fldCharType="begin"/>
+      </w:r>
+      <w:r>
+        <w:instrText xml:space="preserve"> REF _Ref228486692 \r \h </w:instrText>
+      </w:r>
+      <w:r>
+        <w:fldChar w:fldCharType="separate"/>
+      </w:r>
+      <w:r>
+        <w:t>3.6</w:t>
+      </w:r>
+      <w:r>
+        <w:fldChar w:fldCharType="end"/>
+      </w:r>
+      <w:r>
+        <w:t>.</w:t>
+      </w:r>
+    </w:p>
+    <w:p>
+      <w:pPr>
+        <w:pStyle w:val="Heading2"/>
+      </w:pPr>
+      <w:r>
+        <w:t>Output Files</w:t>
+      </w:r>
+    </w:p>
+    <w:p/>
+    <w:p>
+      <w:pPr>
+        <w:pStyle w:val="Heading2"/>
+      </w:pPr>
+      <w:bookmarkStart w:id="2" w:name="_Ref228486710"/>
+      <w:r>
+        <w:t>Parser Settings</w:t>
+      </w:r>
+      <w:bookmarkEnd w:id="2"/>
+    </w:p>
+    <w:p/>
+    <w:p>
+      <w:pPr>
+        <w:pStyle w:val="Heading2"/>
+      </w:pPr>
+      <w:bookmarkStart w:id="3" w:name="_Ref228486692"/>
+      <w:r>
+        <w:t>Combining Multiple COH Reports</w:t>
+      </w:r>
+      <w:bookmarkEnd w:id="3"/>
+    </w:p>
+    <w:p/>
     <w:sectPr>
       <w:pgSz w:w="12240" w:h="15840"/>
       <w:pgMar w:top="1440" w:right="1440" w:bottom="1440" w:left="1440" w:header="720" w:footer="720" w:gutter="0"/>
@@ -275,6 +809,130 @@
     </w:sectPr>
   </w:body>
 </w:document>
+</file>
+
+<file path=word/numbering.xml><?xml version="1.0" encoding="utf-8"?>
+<w:numbering xmlns:wpc="http://schemas.microsoft.com/office/word/2010/wordprocessingCanvas" xmlns:cx="http://schemas.microsoft.com/office/drawing/2014/chartex" xmlns:cx1="http://schemas.microsoft.com/office/drawing/2015/9/8/chartex" xmlns:cx2="http://schemas.microsoft.com/office/drawing/2015/10/21/chartex" xmlns:cx3="http://schemas.microsoft.com/office/drawing/2016/5/9/chartex" xmlns:cx4="http://schemas.microsoft.com/office/drawing/2016/5/10/chartex" xmlns:cx5="http://schemas.microsoft.com/office/drawing/2016/5/11/chartex" xmlns:cx6="http://schemas.microsoft.com/office/drawing/2016/5/12/chartex" xmlns:cx7="http://schemas.microsoft.com/office/drawing/2016/5/13/chartex" xmlns:cx8="http://schemas.microsoft.com/office/drawing/2016/5/14/chartex" xmlns:mc="http://schemas.openxmlformats.org/markup-compatibility/2006" xmlns:aink="http://schemas.microsoft.com/office/drawing/2016/ink" xmlns:am3d="http://schemas.microsoft.com/office/drawing/2017/model3d" xmlns:o="urn:schemas-microsoft-com:office:office" xmlns:oel="http://schemas.microsoft.com/office/2019/extlst" xmlns:r="http://schemas.openxmlformats.org/officeDocument/2006/relationships" xmlns:m="http://schemas.openxmlformats.org/officeDocument/2006/math" xmlns:v="urn:schemas-microsoft-com:vml" xmlns:wp14="http://schemas.microsoft.com/office/word/2010/wordprocessingDrawing" xmlns:wp="http://schemas.openxmlformats.org/drawingml/2006/wordprocessingDrawing" xmlns:w10="urn:schemas-microsoft-com:office:word" xmlns:w="http://schemas.openxmlformats.org/wordprocessingml/2006/main" xmlns:w14="http://schemas.microsoft.com/office/word/2010/wordml" xmlns:w15="http://schemas.microsoft.com/office/word/2012/wordml" xmlns:w16cex="http://schemas.microsoft.com/office/word/2018/wordml/cex" xmlns:w16cid="http://schemas.microsoft.com/office/word/2016/wordml/cid" xmlns:w16="http://schemas.microsoft.com/office/word/2018/wordml" xmlns:w16du="http://schemas.microsoft.com/office/word/2023/wordml/word16du" xmlns:w16sdtdh="http://schemas.microsoft.com/office/word/2020/wordml/sdtdatahash" xmlns:w16sdtfl="http://schemas.microsoft.com/office/word/2024/wordml/sdtformatlock" xmlns:w16se="http://schemas.microsoft.com/office/word/2015/wordml/symex" xmlns:wpg="http://schemas.microsoft.com/office/word/2010/wordprocessingGroup" xmlns:wpi="http://schemas.microsoft.com/office/word/2010/wordprocessingInk" xmlns:wne="http://schemas.microsoft.com/office/word/2006/wordml" xmlns:wps="http://schemas.microsoft.com/office/word/2010/wordprocessingShape" mc:Ignorable="w14 w15 w16se w16cid w16 w16cex w16sdtdh w16sdtfl w16du wp14">
+  <w:abstractNum w:abstractNumId="0" w15:restartNumberingAfterBreak="0">
+    <w:nsid w:val="12BC6E38"/>
+    <w:multiLevelType w:val="multilevel"/>
+    <w:tmpl w:val="0C964422"/>
+    <w:lvl w:ilvl="0">
+      <w:start w:val="1"/>
+      <w:numFmt w:val="decimal"/>
+      <w:pStyle w:val="Heading1"/>
+      <w:lvlText w:val="%1."/>
+      <w:lvlJc w:val="left"/>
+      <w:pPr>
+        <w:ind w:left="360" w:hanging="360"/>
+      </w:pPr>
+      <w:rPr>
+        <w:rFonts w:hint="default"/>
+      </w:rPr>
+    </w:lvl>
+    <w:lvl w:ilvl="1">
+      <w:start w:val="1"/>
+      <w:numFmt w:val="decimal"/>
+      <w:pStyle w:val="Heading2"/>
+      <w:lvlText w:val="%1.%2."/>
+      <w:lvlJc w:val="left"/>
+      <w:pPr>
+        <w:ind w:left="720" w:hanging="360"/>
+      </w:pPr>
+      <w:rPr>
+        <w:rFonts w:hint="default"/>
+      </w:rPr>
+    </w:lvl>
+    <w:lvl w:ilvl="2">
+      <w:start w:val="1"/>
+      <w:numFmt w:val="decimal"/>
+      <w:pStyle w:val="Heading3"/>
+      <w:lvlText w:val="%1.%2.%3."/>
+      <w:lvlJc w:val="left"/>
+      <w:pPr>
+        <w:ind w:left="1080" w:hanging="360"/>
+      </w:pPr>
+      <w:rPr>
+        <w:rFonts w:hint="default"/>
+      </w:rPr>
+    </w:lvl>
+    <w:lvl w:ilvl="3">
+      <w:start w:val="1"/>
+      <w:numFmt w:val="decimal"/>
+      <w:lvlText w:val="%1.%2.%3.%4."/>
+      <w:lvlJc w:val="left"/>
+      <w:pPr>
+        <w:ind w:left="1440" w:hanging="360"/>
+      </w:pPr>
+      <w:rPr>
+        <w:rFonts w:hint="default"/>
+      </w:rPr>
+    </w:lvl>
+    <w:lvl w:ilvl="4">
+      <w:start w:val="1"/>
+      <w:numFmt w:val="lowerLetter"/>
+      <w:lvlText w:val="(%5)"/>
+      <w:lvlJc w:val="left"/>
+      <w:pPr>
+        <w:ind w:left="1800" w:hanging="360"/>
+      </w:pPr>
+      <w:rPr>
+        <w:rFonts w:hint="default"/>
+      </w:rPr>
+    </w:lvl>
+    <w:lvl w:ilvl="5">
+      <w:start w:val="1"/>
+      <w:numFmt w:val="lowerRoman"/>
+      <w:lvlText w:val="(%6)"/>
+      <w:lvlJc w:val="left"/>
+      <w:pPr>
+        <w:ind w:left="2160" w:hanging="360"/>
+      </w:pPr>
+      <w:rPr>
+        <w:rFonts w:hint="default"/>
+      </w:rPr>
+    </w:lvl>
+    <w:lvl w:ilvl="6">
+      <w:start w:val="1"/>
+      <w:numFmt w:val="decimal"/>
+      <w:lvlText w:val="%7."/>
+      <w:lvlJc w:val="left"/>
+      <w:pPr>
+        <w:ind w:left="2520" w:hanging="360"/>
+      </w:pPr>
+      <w:rPr>
+        <w:rFonts w:hint="default"/>
+      </w:rPr>
+    </w:lvl>
+    <w:lvl w:ilvl="7">
+      <w:start w:val="1"/>
+      <w:numFmt w:val="lowerLetter"/>
+      <w:lvlText w:val="%8."/>
+      <w:lvlJc w:val="left"/>
+      <w:pPr>
+        <w:ind w:left="2880" w:hanging="360"/>
+      </w:pPr>
+      <w:rPr>
+        <w:rFonts w:hint="default"/>
+      </w:rPr>
+    </w:lvl>
+    <w:lvl w:ilvl="8">
+      <w:start w:val="1"/>
+      <w:numFmt w:val="lowerRoman"/>
+      <w:lvlText w:val="%9."/>
+      <w:lvlJc w:val="left"/>
+      <w:pPr>
+        <w:ind w:left="3240" w:hanging="360"/>
+      </w:pPr>
+      <w:rPr>
+        <w:rFonts w:hint="default"/>
+      </w:rPr>
+    </w:lvl>
+  </w:abstractNum>
+  <w:num w:numId="1" w16cid:durableId="512763476">
+    <w:abstractNumId w:val="0"/>
+  </w:num>
+</w:numbering>
 </file>
 
 <file path=word/styles.xml><?xml version="1.0" encoding="utf-8"?>
@@ -689,6 +1347,9 @@
     <w:pPr>
       <w:keepNext/>
       <w:keepLines/>
+      <w:numPr>
+        <w:numId w:val="1"/>
+      </w:numPr>
       <w:spacing w:before="360" w:after="80"/>
       <w:outlineLvl w:val="0"/>
     </w:pPr>
@@ -711,6 +1372,10 @@
     <w:pPr>
       <w:keepNext/>
       <w:keepLines/>
+      <w:numPr>
+        <w:ilvl w:val="1"/>
+        <w:numId w:val="1"/>
+      </w:numPr>
       <w:spacing w:before="160" w:after="80"/>
       <w:outlineLvl w:val="1"/>
     </w:pPr>
@@ -734,6 +1399,10 @@
     <w:pPr>
       <w:keepNext/>
       <w:keepLines/>
+      <w:numPr>
+        <w:ilvl w:val="2"/>
+        <w:numId w:val="1"/>
+      </w:numPr>
       <w:spacing w:before="160" w:after="80"/>
       <w:outlineLvl w:val="2"/>
     </w:pPr>
@@ -879,6 +1548,7 @@
   <w:style w:type="character" w:default="1" w:styleId="DefaultParagraphFont">
     <w:name w:val="Default Paragraph Font"/>
     <w:uiPriority w:val="1"/>
+    <w:semiHidden/>
     <w:unhideWhenUsed/>
   </w:style>
   <w:style w:type="table" w:default="1" w:styleId="TableNormal">
@@ -1201,6 +1871,26 @@
       <w:i/>
       <w:iCs/>
       <w:color w:val="404040" w:themeColor="text1" w:themeTint="BF"/>
+    </w:rPr>
+  </w:style>
+  <w:style w:type="paragraph" w:styleId="Caption">
+    <w:name w:val="caption"/>
+    <w:basedOn w:val="Normal"/>
+    <w:next w:val="Normal"/>
+    <w:uiPriority w:val="35"/>
+    <w:unhideWhenUsed/>
+    <w:qFormat/>
+    <w:rsid w:val="00276D00"/>
+    <w:pPr>
+      <w:spacing w:after="200" w:line="240" w:lineRule="auto"/>
+      <w:jc w:val="center"/>
+    </w:pPr>
+    <w:rPr>
+      <w:i/>
+      <w:iCs/>
+      <w:color w:val="44546A" w:themeColor="text2"/>
+      <w:sz w:val="18"/>
+      <w:szCs w:val="18"/>
     </w:rPr>
   </w:style>
 </w:styles>
@@ -1499,4 +2189,16 @@
     </a:ext>
   </a:extLst>
 </a:theme>
+</file>
+
+<file path=customXml/item1.xml><?xml version="1.0" encoding="utf-8"?>
+<b:Sources xmlns:b="http://schemas.openxmlformats.org/officeDocument/2006/bibliography" xmlns="http://schemas.openxmlformats.org/officeDocument/2006/bibliography" SelectedStyle="\APASixthEditionOfficeOnline.xsl" StyleName="APA" Version="6"/>
+</file>
+
+<file path=customXml/itemProps1.xml><?xml version="1.0" encoding="utf-8"?>
+<ds:datastoreItem xmlns:ds="http://schemas.openxmlformats.org/officeDocument/2006/customXml" ds:itemID="{FE622150-65DB-4DFF-B8C7-50DB35A868D0}">
+  <ds:schemaRefs>
+    <ds:schemaRef ds:uri="http://schemas.openxmlformats.org/officeDocument/2006/bibliography"/>
+  </ds:schemaRefs>
+</ds:datastoreItem>
 </file>
</xml_diff>

<commit_message>
Final draft of manual, and updates to parser program to properly count purchased awards.
</commit_message>
<xml_diff>
--- a/TLC Awards Parser Manual.docx
+++ b/TLC Awards Parser Manual.docx
@@ -53,7 +53,13 @@
         <w:rPr>
           <w:rStyle w:val="SubtleEmphasis"/>
         </w:rPr>
-        <w:t>Version 0.2</w:t>
+        <w:t>Version 0.</w:t>
+      </w:r>
+      <w:r>
+        <w:rPr>
+          <w:rStyle w:val="SubtleEmphasis"/>
+        </w:rPr>
+        <w:t>4</w:t>
       </w:r>
     </w:p>
     <w:p>
@@ -102,9 +108,11 @@
       <w:pPr>
         <w:pStyle w:val="Heading1"/>
       </w:pPr>
+      <w:bookmarkStart w:id="0" w:name="_Ref228625820"/>
       <w:r>
         <w:t>Court of Honor Program</w:t>
       </w:r>
+      <w:bookmarkEnd w:id="0"/>
     </w:p>
     <w:p>
       <w:pPr>
@@ -230,7 +238,15 @@
     </w:p>
     <w:p>
       <w:r>
-        <w:t>Prior to the ceremony, read through the entire program. There are several places indicated by triangle brackets (&lt;  &gt;) that are intended to be explicitly updated for each COH. We start with Woodland Trails awards, working from Foxes up to Mountain Lions, announcing the branch pins, sylvan stars, branch patches, forest awards, Woodsmen awards, and Fireguard awards. After that, we call up all Woodland Trails recipients of the Worthy Life award to ensure it has prominent recognition. Finally, we do the same with the Timberline award.</w:t>
+        <w:t>Prior to the ceremony, read through the entire program. There are several places indicated by triangle brackets (</w:t>
+      </w:r>
+      <w:proofErr w:type="gramStart"/>
+      <w:r>
+        <w:t>&lt;  &gt;</w:t>
+      </w:r>
+      <w:proofErr w:type="gramEnd"/>
+      <w:r>
+        <w:t>) that are intended to be explicitly updated for each COH. We start with Woodland Trails awards, working from Foxes up to Mountain Lions, announcing the branch pins, sylvan stars, branch patches, forest awards, Woodsmen awards, and Fireguard awards. After that, we call up all Woodland Trails recipients of the Worthy Life award to ensure it has prominent recognition. Finally, we do the same with the Timberline award.</w:t>
       </w:r>
     </w:p>
     <w:p>
@@ -243,7 +259,15 @@
       </w:r>
       <w:proofErr w:type="spellEnd"/>
       <w:r>
-        <w:t xml:space="preserve">. Next we call up </w:t>
+        <w:t xml:space="preserve">. </w:t>
+      </w:r>
+      <w:proofErr w:type="gramStart"/>
+      <w:r>
+        <w:t>Next</w:t>
+      </w:r>
+      <w:proofErr w:type="gramEnd"/>
+      <w:r>
+        <w:t xml:space="preserve"> we call up </w:t>
       </w:r>
       <w:proofErr w:type="spellStart"/>
       <w:r>
@@ -420,14 +444,19 @@
       <w:r>
         <w:t xml:space="preserve"> By default, it should offer a filename of something like “Court of Honor Report.htm”. It is worth creating a new folder on your computer to store all the COH files (e.g. “May2026_COH”), and save this file into that folder. You may also wish to save off the Awards Shopping List from TLC to the same folder as a reference.</w:t>
       </w:r>
+      <w:r>
+        <w:t xml:space="preserve"> </w:t>
+      </w:r>
     </w:p>
     <w:p>
       <w:pPr>
         <w:pStyle w:val="Heading2"/>
       </w:pPr>
+      <w:bookmarkStart w:id="1" w:name="_Ref228634914"/>
       <w:r>
         <w:t>Running the Parser Program</w:t>
       </w:r>
+      <w:bookmarkEnd w:id="1"/>
     </w:p>
     <w:p>
       <w:r>
@@ -502,6 +531,9 @@
         <w:jc w:val="center"/>
       </w:pPr>
       <w:r>
+        <w:rPr>
+          <w:noProof/>
+        </w:rPr>
         <w:lastRenderedPageBreak/>
         <w:drawing>
           <wp:inline distT="0" distB="0" distL="0" distR="0" wp14:anchorId="6C5BB71C" wp14:editId="68B57597">
@@ -544,19 +576,32 @@
       <w:pPr>
         <w:pStyle w:val="Caption"/>
       </w:pPr>
-      <w:bookmarkStart w:id="0" w:name="_Ref228487420"/>
+      <w:bookmarkStart w:id="2" w:name="_Ref228487420"/>
       <w:r>
         <w:t xml:space="preserve">Figure </w:t>
       </w:r>
-      <w:fldSimple w:instr=" SEQ Figure \* ARABIC ">
-        <w:r>
-          <w:rPr>
-            <w:noProof/>
-          </w:rPr>
-          <w:t>1</w:t>
-        </w:r>
-      </w:fldSimple>
-      <w:bookmarkEnd w:id="0"/>
+      <w:r>
+        <w:fldChar w:fldCharType="begin"/>
+      </w:r>
+      <w:r>
+        <w:instrText xml:space="preserve"> SEQ Figure \* ARABIC </w:instrText>
+      </w:r>
+      <w:r>
+        <w:fldChar w:fldCharType="separate"/>
+      </w:r>
+      <w:r>
+        <w:rPr>
+          <w:noProof/>
+        </w:rPr>
+        <w:t>1</w:t>
+      </w:r>
+      <w:r>
+        <w:rPr>
+          <w:noProof/>
+        </w:rPr>
+        <w:fldChar w:fldCharType="end"/>
+      </w:r>
+      <w:bookmarkEnd w:id="2"/>
       <w:r>
         <w:t>. Parser program file selector dialog box. Select the HTML format file saved from the TLC Court of Honor web page.</w:t>
       </w:r>
@@ -709,19 +754,32 @@
       <w:pPr>
         <w:pStyle w:val="Caption"/>
       </w:pPr>
-      <w:bookmarkStart w:id="1" w:name="_Ref228487442"/>
+      <w:bookmarkStart w:id="3" w:name="_Ref228487442"/>
       <w:r>
         <w:t xml:space="preserve">Figure </w:t>
       </w:r>
-      <w:fldSimple w:instr=" SEQ Figure \* ARABIC ">
-        <w:r>
-          <w:rPr>
-            <w:noProof/>
-          </w:rPr>
-          <w:t>2</w:t>
-        </w:r>
-      </w:fldSimple>
-      <w:bookmarkEnd w:id="1"/>
+      <w:r>
+        <w:fldChar w:fldCharType="begin"/>
+      </w:r>
+      <w:r>
+        <w:instrText xml:space="preserve"> SEQ Figure \* ARABIC </w:instrText>
+      </w:r>
+      <w:r>
+        <w:fldChar w:fldCharType="separate"/>
+      </w:r>
+      <w:r>
+        <w:rPr>
+          <w:noProof/>
+        </w:rPr>
+        <w:t>2</w:t>
+      </w:r>
+      <w:r>
+        <w:rPr>
+          <w:noProof/>
+        </w:rPr>
+        <w:fldChar w:fldCharType="end"/>
+      </w:r>
+      <w:bookmarkEnd w:id="3"/>
       <w:r>
         <w:t xml:space="preserve">. Custom badge name selection box. This specific badge was "Lifeguard" and was completed via the </w:t>
       </w:r>
@@ -746,6 +804,27 @@
     </w:p>
     <w:p>
       <w:r>
+        <w:t xml:space="preserve">You may need to manually review the information prior to packaging awards. For example, if a </w:t>
+      </w:r>
+      <w:proofErr w:type="spellStart"/>
+      <w:r>
+        <w:t>Trailman</w:t>
+      </w:r>
+      <w:proofErr w:type="spellEnd"/>
+      <w:r>
+        <w:t xml:space="preserve"> earned his Worthy Life award at a different program level, he will not need to receive the Worthy Life ribbon a second time. Additionally, if your troop chooses to hand out rank patches at troop meetings when they are earned, those patches should not be packaged for award again. </w:t>
+      </w:r>
+      <w:proofErr w:type="spellStart"/>
+      <w:r>
+        <w:t>Trailmen</w:t>
+      </w:r>
+      <w:proofErr w:type="spellEnd"/>
+      <w:r>
+        <w:t xml:space="preserve"> earning Able rank should receive the Troop Standard and Standard Medallion. Notes about particular awards to pay attention to are included in the output shopping list.</w:t>
+      </w:r>
+    </w:p>
+    <w:p>
+      <w:r>
         <w:t xml:space="preserve">After generating the output files, it is useful to compare the generated shopping list Excel file (discussed in the next section) to the TLC Shopping List report. If both lists match, the recommended practice is to mark all awards in TLC as “Purchased”. If additional awards are added to TLC subsequent to generating the report and before the COH date, they will be clearly identifiable, as they will be the only ones not marked as Purchased. If desired, the parser program can be configured to combine these additional awards with the </w:t>
       </w:r>
       <w:r>
@@ -778,29 +857,1745 @@
         <w:t>Output Files</w:t>
       </w:r>
     </w:p>
+    <w:p>
+      <w:r>
+        <w:t>When run with default settings, the parser program will write 6 files to the directory containing the input COH report. As noted in the previous section, one of these output files (</w:t>
+      </w:r>
+      <w:r>
+        <w:t>TL_Awards_Parser_settings.xml</w:t>
+      </w:r>
+      <w:r>
+        <w:t xml:space="preserve">) is a copy of the settings used to configure the awards parsing process. Details of that file are discussed in section </w:t>
+      </w:r>
+      <w:r>
+        <w:fldChar w:fldCharType="begin"/>
+      </w:r>
+      <w:r>
+        <w:instrText xml:space="preserve"> REF _Ref228486710 \r \h </w:instrText>
+      </w:r>
+      <w:r>
+        <w:fldChar w:fldCharType="separate"/>
+      </w:r>
+      <w:r>
+        <w:t>3.5</w:t>
+      </w:r>
+      <w:r>
+        <w:fldChar w:fldCharType="end"/>
+      </w:r>
+      <w:r>
+        <w:t xml:space="preserve">. Two additional optional output files may be created when combining multiple COH reports. The process and resulting output files are discussed in section </w:t>
+      </w:r>
+      <w:r>
+        <w:fldChar w:fldCharType="begin"/>
+      </w:r>
+      <w:r>
+        <w:instrText xml:space="preserve"> REF _Ref228486692 \r \h </w:instrText>
+      </w:r>
+      <w:r>
+        <w:fldChar w:fldCharType="separate"/>
+      </w:r>
+      <w:r>
+        <w:t>3.6</w:t>
+      </w:r>
+      <w:r>
+        <w:fldChar w:fldCharType="end"/>
+      </w:r>
+      <w:r>
+        <w:t>.</w:t>
+      </w:r>
+    </w:p>
+    <w:p>
+      <w:pPr>
+        <w:pStyle w:val="Heading3"/>
+      </w:pPr>
+      <w:bookmarkStart w:id="4" w:name="_Ref228631123"/>
+      <w:r>
+        <w:t>Award Cards File</w:t>
+      </w:r>
+      <w:bookmarkEnd w:id="4"/>
+    </w:p>
+    <w:p>
+      <w:r>
+        <w:t xml:space="preserve">The name of this output file is configurable with the </w:t>
+      </w:r>
+      <w:proofErr w:type="spellStart"/>
+      <w:r>
+        <w:t>AwardsCardsOutputFile</w:t>
+      </w:r>
+      <w:proofErr w:type="spellEnd"/>
+      <w:r>
+        <w:t xml:space="preserve"> field in the settings file. By default, it is named “</w:t>
+      </w:r>
+      <w:r>
+        <w:t>awards_detail_cards.html</w:t>
+      </w:r>
+      <w:r>
+        <w:t xml:space="preserve">”. This file is a conveniently formatted printable file containing all awards to be presented, grouped by </w:t>
+      </w:r>
+      <w:proofErr w:type="spellStart"/>
+      <w:r>
+        <w:t>Trailman</w:t>
+      </w:r>
+      <w:proofErr w:type="spellEnd"/>
+      <w:r>
+        <w:t xml:space="preserve"> name and </w:t>
+      </w:r>
+      <w:proofErr w:type="spellStart"/>
+      <w:r>
+        <w:t>Trailman</w:t>
+      </w:r>
+      <w:proofErr w:type="spellEnd"/>
+      <w:r>
+        <w:t xml:space="preserve"> level. This file is very similar to the raw COH report, except that it is formatted correctly for printing without additional zooming or sizing.</w:t>
+      </w:r>
+      <w:r>
+        <w:t xml:space="preserve"> In addition, the color corresponding to the Woodland Trails branch pins and sylvan stars will be noted in the details section of the card.</w:t>
+      </w:r>
+    </w:p>
+    <w:p>
+      <w:r>
+        <w:lastRenderedPageBreak/>
+        <w:t>Each level will be separated by a page break, so individual levels can be easily separated for packaging</w:t>
+      </w:r>
+      <w:r>
+        <w:t xml:space="preserve"> or announcing</w:t>
+      </w:r>
+      <w:r>
+        <w:t xml:space="preserve"> awards</w:t>
+      </w:r>
+      <w:r>
+        <w:t xml:space="preserve">. Each </w:t>
+      </w:r>
+      <w:proofErr w:type="spellStart"/>
+      <w:r>
+        <w:t>Trailman</w:t>
+      </w:r>
+      <w:proofErr w:type="spellEnd"/>
+      <w:r>
+        <w:t xml:space="preserve"> will have a single block (surrounded by a thin border). The blocks can be cut out and will fit comfortably inside a snack-sized baggie, along with the awards to be presented.</w:t>
+      </w:r>
+    </w:p>
+    <w:p>
+      <w:r>
+        <w:t xml:space="preserve">If </w:t>
+      </w:r>
+      <w:proofErr w:type="spellStart"/>
+      <w:r>
+        <w:t>SkipPurchasedRanks</w:t>
+      </w:r>
+      <w:proofErr w:type="spellEnd"/>
+      <w:r>
+        <w:t xml:space="preserve"> </w:t>
+      </w:r>
+      <w:r>
+        <w:t xml:space="preserve">is set to 1, Navigator and Adventurer rank awards marked as “purchased” in the COH report will NOT be included </w:t>
+      </w:r>
+      <w:proofErr w:type="spellStart"/>
+      <w:r>
+        <w:t>Trailman</w:t>
+      </w:r>
+      <w:proofErr w:type="spellEnd"/>
+      <w:r>
+        <w:t xml:space="preserve"> award cards. If </w:t>
+      </w:r>
+      <w:proofErr w:type="spellStart"/>
+      <w:r>
+        <w:t>SkipPurchasedAwards</w:t>
+      </w:r>
+      <w:proofErr w:type="spellEnd"/>
+      <w:r>
+        <w:t xml:space="preserve"> is set to 1, all other awards marked as “purchased” in the COH report will NOT be included on the </w:t>
+      </w:r>
+      <w:proofErr w:type="spellStart"/>
+      <w:r>
+        <w:t>Trailman</w:t>
+      </w:r>
+      <w:proofErr w:type="spellEnd"/>
+      <w:r>
+        <w:t xml:space="preserve"> award cards.</w:t>
+      </w:r>
+    </w:p>
+    <w:p>
+      <w:pPr>
+        <w:pStyle w:val="Heading3"/>
+      </w:pPr>
+      <w:bookmarkStart w:id="5" w:name="_Ref228631196"/>
+      <w:r>
+        <w:t>Awards Program File</w:t>
+      </w:r>
+      <w:bookmarkEnd w:id="5"/>
+    </w:p>
+    <w:p>
+      <w:r>
+        <w:t xml:space="preserve">The name of this output file is configurable with the </w:t>
+      </w:r>
+      <w:proofErr w:type="spellStart"/>
+      <w:r>
+        <w:t>AwardsProgramOutputFile</w:t>
+      </w:r>
+      <w:proofErr w:type="spellEnd"/>
+      <w:r>
+        <w:t xml:space="preserve"> </w:t>
+      </w:r>
+      <w:r>
+        <w:t>field in the settings file. By default, it is named “</w:t>
+      </w:r>
+      <w:r>
+        <w:t>awards_program.html</w:t>
+      </w:r>
+      <w:r>
+        <w:t>”.</w:t>
+      </w:r>
+      <w:r>
+        <w:t xml:space="preserve"> This file lists the awards by </w:t>
+      </w:r>
+      <w:proofErr w:type="spellStart"/>
+      <w:r>
+        <w:t>Trailman</w:t>
+      </w:r>
+      <w:proofErr w:type="spellEnd"/>
+      <w:r>
+        <w:t xml:space="preserve"> and level in a format matching the Court of Honor program described in section </w:t>
+      </w:r>
+      <w:r>
+        <w:fldChar w:fldCharType="begin"/>
+      </w:r>
+      <w:r>
+        <w:instrText xml:space="preserve"> REF _Ref228625820 \r \h </w:instrText>
+      </w:r>
+      <w:r>
+        <w:fldChar w:fldCharType="separate"/>
+      </w:r>
+      <w:r>
+        <w:t>2</w:t>
+      </w:r>
+      <w:r>
+        <w:fldChar w:fldCharType="end"/>
+      </w:r>
+      <w:r>
+        <w:t xml:space="preserve">. </w:t>
+      </w:r>
+      <w:r>
+        <w:t>It is intended to be printed as-is and read as a component of the Court of Honor awards program. It is similar to the award cards, but with some key differences:</w:t>
+      </w:r>
+    </w:p>
+    <w:p>
+      <w:pPr>
+        <w:pStyle w:val="ListParagraph"/>
+        <w:numPr>
+          <w:ilvl w:val="0"/>
+          <w:numId w:val="2"/>
+        </w:numPr>
+      </w:pPr>
+      <w:proofErr w:type="spellStart"/>
+      <w:r>
+        <w:t>Trailmen</w:t>
+      </w:r>
+      <w:proofErr w:type="spellEnd"/>
+      <w:r>
+        <w:t xml:space="preserve"> names are listed in First Last format instead of the Last, </w:t>
+      </w:r>
+      <w:proofErr w:type="gramStart"/>
+      <w:r>
+        <w:t>First</w:t>
+      </w:r>
+      <w:proofErr w:type="gramEnd"/>
+      <w:r>
+        <w:t xml:space="preserve"> format specified in the TLC COH report.</w:t>
+      </w:r>
+    </w:p>
+    <w:p>
+      <w:pPr>
+        <w:pStyle w:val="ListParagraph"/>
+        <w:numPr>
+          <w:ilvl w:val="0"/>
+          <w:numId w:val="2"/>
+        </w:numPr>
+      </w:pPr>
+      <w:r>
+        <w:t>Only award names are listed. Details and completion date fields are excluded.</w:t>
+      </w:r>
+    </w:p>
+    <w:p>
+      <w:pPr>
+        <w:pStyle w:val="ListParagraph"/>
+        <w:numPr>
+          <w:ilvl w:val="0"/>
+          <w:numId w:val="2"/>
+        </w:numPr>
+      </w:pPr>
+      <w:r>
+        <w:t>Woodland Trails branch pins grouped under a single entry (e.g. “2 Fox Branch Pins” instead of “</w:t>
+      </w:r>
+      <w:r>
+        <w:t>Life Skills Branch (Branch Pin)</w:t>
+      </w:r>
+      <w:r>
+        <w:t>” and “</w:t>
+      </w:r>
+      <w:r>
+        <w:t>Values Branch (Branch Pin)</w:t>
+      </w:r>
+      <w:r>
+        <w:t>”), as are sylvan stars.</w:t>
+      </w:r>
+    </w:p>
+    <w:p>
+      <w:pPr>
+        <w:pStyle w:val="ListParagraph"/>
+        <w:numPr>
+          <w:ilvl w:val="0"/>
+          <w:numId w:val="2"/>
+        </w:numPr>
+      </w:pPr>
+      <w:r>
+        <w:t xml:space="preserve">Navigator/Adventurer ranks, Worthy Life Awards, Timberline Awards, and Ridgeline Awards are removed from the individual </w:t>
+      </w:r>
+      <w:proofErr w:type="spellStart"/>
+      <w:r>
+        <w:t>Trailmen</w:t>
+      </w:r>
+      <w:proofErr w:type="spellEnd"/>
+      <w:r>
+        <w:t xml:space="preserve"> blocks and displayed as a single block to match the approach of the program.</w:t>
+      </w:r>
+    </w:p>
+    <w:p>
+      <w:pPr>
+        <w:pStyle w:val="Heading3"/>
+      </w:pPr>
+      <w:bookmarkStart w:id="6" w:name="_Ref228631365"/>
+      <w:r>
+        <w:t>Awards Shopping List</w:t>
+      </w:r>
+      <w:bookmarkEnd w:id="6"/>
+    </w:p>
+    <w:p>
+      <w:r>
+        <w:t xml:space="preserve">The name of this output file is configurable with the </w:t>
+      </w:r>
+      <w:proofErr w:type="spellStart"/>
+      <w:r>
+        <w:t>AwardsShoppingList</w:t>
+      </w:r>
+      <w:proofErr w:type="spellEnd"/>
+      <w:r>
+        <w:t xml:space="preserve"> field in the settings file. By default, it is </w:t>
+      </w:r>
+      <w:r>
+        <w:t xml:space="preserve">a time-stamped file with the name “COH-shopping-list-YYYYMMDDhhmm.xlsx”. This file should be compared to the TLC shopping list to confirm that the awards have been correctly parsed. In addition, this sheet can be used to update the awards inventory sheet, as discussed in section </w:t>
+      </w:r>
+      <w:r>
+        <w:fldChar w:fldCharType="begin"/>
+      </w:r>
+      <w:r>
+        <w:instrText xml:space="preserve"> REF _Ref228626584 \r \h </w:instrText>
+      </w:r>
+      <w:r>
+        <w:fldChar w:fldCharType="separate"/>
+      </w:r>
+      <w:r>
+        <w:t>4</w:t>
+      </w:r>
+      <w:r>
+        <w:fldChar w:fldCharType="end"/>
+      </w:r>
+      <w:r>
+        <w:t>.</w:t>
+      </w:r>
+      <w:r>
+        <w:t xml:space="preserve"> Note that this file never includes awards marked as “purchased” in TLC.</w:t>
+      </w:r>
+    </w:p>
+    <w:p>
+      <w:pPr>
+        <w:pStyle w:val="Heading3"/>
+      </w:pPr>
+      <w:bookmarkStart w:id="7" w:name="_Ref228631558"/>
+      <w:r>
+        <w:t>Full Awards Listing</w:t>
+      </w:r>
+      <w:bookmarkEnd w:id="7"/>
+    </w:p>
+    <w:p>
+      <w:r>
+        <w:t xml:space="preserve">This is an optional output file, with a name configurable with the </w:t>
+      </w:r>
+      <w:proofErr w:type="spellStart"/>
+      <w:r>
+        <w:t>FullAwardsOutputFile</w:t>
+      </w:r>
+      <w:proofErr w:type="spellEnd"/>
+      <w:r>
+        <w:t xml:space="preserve"> field in the settings file. By default, it will be generated with the name “</w:t>
+      </w:r>
+      <w:r>
+        <w:t>awards_full_listing.html</w:t>
+      </w:r>
+      <w:r>
+        <w:t>”. If the filename is left blank in the settings file, this output will not be created.</w:t>
+      </w:r>
+    </w:p>
+    <w:p>
+      <w:r>
+        <w:lastRenderedPageBreak/>
+        <w:t xml:space="preserve">This file is essentially the same as the Awards Cards output, except that it adds a “Purchased” column for each of the </w:t>
+      </w:r>
+      <w:proofErr w:type="spellStart"/>
+      <w:r>
+        <w:t>Trailmen</w:t>
+      </w:r>
+      <w:proofErr w:type="spellEnd"/>
+      <w:r>
+        <w:t xml:space="preserve"> awards blocks and indicates if the awards are marked as “purchased” in TLC. This file is primarily intended for error checking and documentation.</w:t>
+      </w:r>
+    </w:p>
+    <w:p>
+      <w:pPr>
+        <w:pStyle w:val="Heading3"/>
+      </w:pPr>
+      <w:r>
+        <w:t>COH Data File</w:t>
+      </w:r>
+    </w:p>
+    <w:p>
+      <w:r>
+        <w:t>The parser program will always generate a time-stamped binary data file named “COH-data-</w:t>
+      </w:r>
+      <w:proofErr w:type="spellStart"/>
+      <w:r>
+        <w:t>YYYYMMDDhhmm.pkl</w:t>
+      </w:r>
+      <w:proofErr w:type="spellEnd"/>
+      <w:r>
+        <w:t xml:space="preserve">”. This is a dump of the </w:t>
+      </w:r>
+      <w:proofErr w:type="spellStart"/>
+      <w:r>
+        <w:t>COH_Report</w:t>
+      </w:r>
+      <w:proofErr w:type="spellEnd"/>
+      <w:r>
+        <w:t xml:space="preserve"> Python class used in the program. It can be read using the Python pickle module for error checking and debugging. It is also used by the parser program if additional awards are added in TLC subsequent to the initial awards parsing so that the new awards can be added to the previously generated program. See section </w:t>
+      </w:r>
+      <w:r>
+        <w:fldChar w:fldCharType="begin"/>
+      </w:r>
+      <w:r>
+        <w:instrText xml:space="preserve"> REF _Ref228486692 \r \h </w:instrText>
+      </w:r>
+      <w:r>
+        <w:fldChar w:fldCharType="separate"/>
+      </w:r>
+      <w:r>
+        <w:t>3.6</w:t>
+      </w:r>
+      <w:r>
+        <w:fldChar w:fldCharType="end"/>
+      </w:r>
+      <w:r>
+        <w:t xml:space="preserve"> for additional information.</w:t>
+      </w:r>
+    </w:p>
+    <w:p>
+      <w:pPr>
+        <w:pStyle w:val="Heading2"/>
+      </w:pPr>
+      <w:bookmarkStart w:id="8" w:name="_Ref228486710"/>
+      <w:r>
+        <w:t>Parser Settings</w:t>
+      </w:r>
+      <w:bookmarkEnd w:id="8"/>
+    </w:p>
+    <w:p>
+      <w:r>
+        <w:t>A copy of the default parser settings file is included with parser program. That file is not read directly and is provided for reference only. If you wish to change any of the parser settings, place a file named TL_Awards_Parser_settings.xml in the same directory as your COH report file and update it as needed.</w:t>
+      </w:r>
+    </w:p>
+    <w:p>
+      <w:r>
+        <w:t>Note that XML tags are normally entered in the form &lt;</w:t>
+      </w:r>
+      <w:proofErr w:type="spellStart"/>
+      <w:r>
+        <w:t>TagName</w:t>
+      </w:r>
+      <w:proofErr w:type="spellEnd"/>
+      <w:r>
+        <w:t>&gt;data&lt;/</w:t>
+      </w:r>
+      <w:proofErr w:type="spellStart"/>
+      <w:r>
+        <w:t>TagName</w:t>
+      </w:r>
+      <w:proofErr w:type="spellEnd"/>
+      <w:r>
+        <w:t>&gt;. A blank field (i.e. where “data” should have no value) can be listed in the form &lt;</w:t>
+      </w:r>
+      <w:proofErr w:type="spellStart"/>
+      <w:r>
+        <w:t>TagName</w:t>
+      </w:r>
+      <w:proofErr w:type="spellEnd"/>
+      <w:r>
+        <w:t xml:space="preserve">/&gt;. In the default settings file, </w:t>
+      </w:r>
+      <w:proofErr w:type="spellStart"/>
+      <w:r>
+        <w:t>AwardsShoppingList</w:t>
+      </w:r>
+      <w:proofErr w:type="spellEnd"/>
+      <w:r>
+        <w:t xml:space="preserve">, </w:t>
+      </w:r>
+      <w:r>
+        <w:t>PreviousDataFile</w:t>
+      </w:r>
+      <w:r>
+        <w:t xml:space="preserve">, and </w:t>
+      </w:r>
+      <w:proofErr w:type="spellStart"/>
+      <w:r>
+        <w:t>NewAwardsCardsOutputFile</w:t>
+      </w:r>
+      <w:proofErr w:type="spellEnd"/>
+      <w:r>
+        <w:t xml:space="preserve"> are blank and are listed in the second format. If you wish to specify values for any of these, you will need to change the field to the first format. For </w:t>
+      </w:r>
+      <w:proofErr w:type="gramStart"/>
+      <w:r>
+        <w:t>example</w:t>
+      </w:r>
+      <w:proofErr w:type="gramEnd"/>
+      <w:r>
+        <w:t xml:space="preserve"> “</w:t>
+      </w:r>
+      <w:r>
+        <w:t>&lt;</w:t>
+      </w:r>
+      <w:proofErr w:type="spellStart"/>
+      <w:r>
+        <w:t>AwardsShoppingList</w:t>
+      </w:r>
+      <w:proofErr w:type="spellEnd"/>
+      <w:r>
+        <w:t>/&gt;</w:t>
+      </w:r>
+      <w:r>
+        <w:t>” would need to be replaced with “</w:t>
+      </w:r>
+      <w:r>
+        <w:t>&lt;AwardsShoppingList&gt;</w:t>
+      </w:r>
+      <w:r>
+        <w:t>new_shopping_list_name.xlsx</w:t>
+      </w:r>
+      <w:r>
+        <w:t>&lt;</w:t>
+      </w:r>
+      <w:r>
+        <w:t>/</w:t>
+      </w:r>
+      <w:r>
+        <w:t>AwardsShoppingList&gt;</w:t>
+      </w:r>
+      <w:r>
+        <w:t>” or similar.</w:t>
+      </w:r>
+    </w:p>
+    <w:p>
+      <w:r>
+        <w:t xml:space="preserve">The settings file has two sections: </w:t>
+      </w:r>
+      <w:r>
+        <w:t>Settings</w:t>
+      </w:r>
+      <w:r>
+        <w:t xml:space="preserve"> contains the main parser program configuration options, while </w:t>
+      </w:r>
+      <w:proofErr w:type="spellStart"/>
+      <w:r>
+        <w:t>DYOBadges</w:t>
+      </w:r>
+      <w:proofErr w:type="spellEnd"/>
+      <w:r>
+        <w:t xml:space="preserve"> is used to specify custom names of Design Your Own/TEAMS badges to be listed in the awards program.</w:t>
+      </w:r>
+    </w:p>
+    <w:p>
+      <w:pPr>
+        <w:pStyle w:val="Heading3"/>
+      </w:pPr>
+      <w:bookmarkStart w:id="9" w:name="_Ref228635578"/>
+      <w:r>
+        <w:t>Settings Options</w:t>
+      </w:r>
+      <w:bookmarkEnd w:id="9"/>
+    </w:p>
+    <w:p>
+      <w:pPr>
+        <w:pStyle w:val="Heading4"/>
+      </w:pPr>
+      <w:proofErr w:type="spellStart"/>
+      <w:r>
+        <w:t>SkipPurchasedAwards</w:t>
+      </w:r>
+      <w:proofErr w:type="spellEnd"/>
+    </w:p>
+    <w:p>
+      <w:r>
+        <w:t>Default: 1</w:t>
+      </w:r>
+    </w:p>
+    <w:p>
+      <w:r>
+        <w:t xml:space="preserve">This should either be 1 or 0. When it is set to 1, awards (apart from </w:t>
+      </w:r>
+      <w:r>
+        <w:t>Navigator/Adventurer ranks) that are marked in TLC as “purchased” will not be included in the Awards Cards or Awards Program output files. Setting this to 0 will result in all awards listed in the TLC COH report to be noted in both the Awards Cards and Awards Program outputs.</w:t>
+      </w:r>
+      <w:r>
+        <w:t xml:space="preserve"> This does not impact the output shopping list, which always excludes purchased awards.</w:t>
+      </w:r>
+    </w:p>
+    <w:p>
+      <w:r>
+        <w:lastRenderedPageBreak/>
+        <w:t xml:space="preserve">The intention behind this setting is to allow “purchased” to be synonymous with “previously packed and prepared for award”. This would either be the case with awards that were announced at a previous COH but never collected by the </w:t>
+      </w:r>
+      <w:proofErr w:type="spellStart"/>
+      <w:r>
+        <w:t>Trailman</w:t>
+      </w:r>
+      <w:proofErr w:type="spellEnd"/>
+      <w:r>
+        <w:t xml:space="preserve"> or for awards already prepared for this COH. The Full Awards output file will show all awards regardless of this setting.</w:t>
+      </w:r>
+    </w:p>
+    <w:p>
+      <w:pPr>
+        <w:pStyle w:val="Heading4"/>
+      </w:pPr>
+      <w:proofErr w:type="spellStart"/>
+      <w:r>
+        <w:t>SkipPurchasedRanks</w:t>
+      </w:r>
+      <w:proofErr w:type="spellEnd"/>
+    </w:p>
+    <w:p>
+      <w:r>
+        <w:t>Default: 0</w:t>
+      </w:r>
+    </w:p>
+    <w:p>
+      <w:r>
+        <w:t xml:space="preserve">This should either be 1 or 0. When it is set to 1, Navigator/Adventurer ranks that are marked in TLC as “purchased” will not be included in the Awards Cards or Awards Program output files. Setting this to 0 will result in all </w:t>
+      </w:r>
+      <w:r>
+        <w:t>ranks</w:t>
+      </w:r>
+      <w:r>
+        <w:t xml:space="preserve"> listed in the TLC COH report to be noted in both the Awards Cards and Awards Program outputs.</w:t>
+      </w:r>
+      <w:r>
+        <w:t xml:space="preserve"> This does not impact the output shopping list, which always excludes purchased awards.</w:t>
+      </w:r>
+    </w:p>
+    <w:p>
+      <w:r>
+        <w:t>The intention behind this setting is to allow “purchased”</w:t>
+      </w:r>
+      <w:r>
+        <w:t xml:space="preserve"> ranks</w:t>
+      </w:r>
+      <w:r>
+        <w:t xml:space="preserve"> to be synonymous with “</w:t>
+      </w:r>
+      <w:r>
+        <w:t>rank announced in a Trail Life Meeting</w:t>
+      </w:r>
+      <w:r>
+        <w:t xml:space="preserve">”. </w:t>
+      </w:r>
+      <w:r>
+        <w:t xml:space="preserve">Our troop will commonly announce ranks and hand out rank patches at meetings when the Boards of Review are completed successfully. That way </w:t>
+      </w:r>
+      <w:proofErr w:type="spellStart"/>
+      <w:r>
+        <w:t>Trailmen</w:t>
+      </w:r>
+      <w:proofErr w:type="spellEnd"/>
+      <w:r>
+        <w:t xml:space="preserve"> receive immediate recognition for their progress. Rank medallions are presented at the COH, and all ranks earned since the last COH are recognized.</w:t>
+      </w:r>
+    </w:p>
+    <w:p>
+      <w:r>
+        <w:t>Note that this interpretation differs from that used for all other awards, so care has to be taken at COH time to distinguish whether a rank award was already packaged or was previously announced, and whether a patch needs to be awarded or not.</w:t>
+      </w:r>
+    </w:p>
+    <w:p>
+      <w:pPr>
+        <w:pStyle w:val="Heading4"/>
+      </w:pPr>
+      <w:proofErr w:type="spellStart"/>
+      <w:r>
+        <w:t>AwardsCardsOutputFile</w:t>
+      </w:r>
+      <w:proofErr w:type="spellEnd"/>
+    </w:p>
+    <w:p>
+      <w:r>
+        <w:t xml:space="preserve">Default: </w:t>
+      </w:r>
+      <w:r>
+        <w:t>awards_detail_cards.html</w:t>
+      </w:r>
+    </w:p>
+    <w:p>
+      <w:r>
+        <w:t xml:space="preserve">This is the file name for the Awards Cards that may be printed and used for packaging awards. </w:t>
+      </w:r>
+      <w:proofErr w:type="gramStart"/>
+      <w:r>
+        <w:t>Typically</w:t>
+      </w:r>
+      <w:proofErr w:type="gramEnd"/>
+      <w:r>
+        <w:t xml:space="preserve"> this filename need not be changed unless you are combining a new COH report file with an existing report and want to retain the existing files for reference. See section </w:t>
+      </w:r>
+      <w:r>
+        <w:fldChar w:fldCharType="begin"/>
+      </w:r>
+      <w:r>
+        <w:instrText xml:space="preserve"> REF _Ref228631123 \r \h </w:instrText>
+      </w:r>
+      <w:r>
+        <w:fldChar w:fldCharType="separate"/>
+      </w:r>
+      <w:r>
+        <w:t>3.4.1</w:t>
+      </w:r>
+      <w:r>
+        <w:fldChar w:fldCharType="end"/>
+      </w:r>
+      <w:r>
+        <w:t xml:space="preserve"> for more information on this file.</w:t>
+      </w:r>
+    </w:p>
+    <w:p>
+      <w:pPr>
+        <w:pStyle w:val="Heading4"/>
+      </w:pPr>
+      <w:proofErr w:type="spellStart"/>
+      <w:r>
+        <w:t>AwardsProgramOutputFile</w:t>
+      </w:r>
+      <w:proofErr w:type="spellEnd"/>
+    </w:p>
+    <w:p>
+      <w:r>
+        <w:t xml:space="preserve">Default: </w:t>
+      </w:r>
+      <w:r>
+        <w:t>awards_program.html</w:t>
+      </w:r>
+    </w:p>
+    <w:p>
+      <w:r>
+        <w:t xml:space="preserve">This is the file name for the Awards </w:t>
+      </w:r>
+      <w:r>
+        <w:t>Program</w:t>
+      </w:r>
+      <w:r>
+        <w:t xml:space="preserve"> that may be printed and used </w:t>
+      </w:r>
+      <w:r>
+        <w:t>with the COH Program for announcing awards at a COH</w:t>
+      </w:r>
+      <w:r>
+        <w:t xml:space="preserve">. </w:t>
+      </w:r>
+      <w:proofErr w:type="gramStart"/>
+      <w:r>
+        <w:t>Typically</w:t>
+      </w:r>
+      <w:proofErr w:type="gramEnd"/>
+      <w:r>
+        <w:t xml:space="preserve"> this filename need not be changed unless you are combining a new COH report file with an existing report and want to retain the existing files for reference. See section </w:t>
+      </w:r>
+      <w:r>
+        <w:fldChar w:fldCharType="begin"/>
+      </w:r>
+      <w:r>
+        <w:instrText xml:space="preserve"> REF _Ref228631196 \r \h </w:instrText>
+      </w:r>
+      <w:r>
+        <w:fldChar w:fldCharType="separate"/>
+      </w:r>
+      <w:r>
+        <w:t>3.4.2</w:t>
+      </w:r>
+      <w:r>
+        <w:fldChar w:fldCharType="end"/>
+      </w:r>
+      <w:r>
+        <w:t xml:space="preserve"> for more information on this file.</w:t>
+      </w:r>
+    </w:p>
+    <w:p>
+      <w:pPr>
+        <w:pStyle w:val="Heading4"/>
+      </w:pPr>
+      <w:proofErr w:type="spellStart"/>
+      <w:r>
+        <w:t>AwardsShoppingList</w:t>
+      </w:r>
+      <w:proofErr w:type="spellEnd"/>
+    </w:p>
+    <w:p>
+      <w:r>
+        <w:t xml:space="preserve">Default: </w:t>
+      </w:r>
+    </w:p>
+    <w:p>
+      <w:r>
+        <w:lastRenderedPageBreak/>
+        <w:t xml:space="preserve">This is the file name for the </w:t>
+      </w:r>
+      <w:r>
+        <w:t xml:space="preserve">awards shopping list. It may be compared with the TLC Shopping List and used to update an Awards Inventory sheet. A blank entry </w:t>
+      </w:r>
+      <w:r>
+        <w:t xml:space="preserve">(which is the default) </w:t>
+      </w:r>
+      <w:r>
+        <w:t xml:space="preserve">for this </w:t>
+      </w:r>
+      <w:r>
+        <w:t>field will result in a time-stamped file name, which also means it will not be overwritten by successive calls to the parser program.</w:t>
+      </w:r>
+      <w:r>
+        <w:t xml:space="preserve"> See section </w:t>
+      </w:r>
+      <w:r>
+        <w:fldChar w:fldCharType="begin"/>
+      </w:r>
+      <w:r>
+        <w:instrText xml:space="preserve"> REF _Ref228631365 \r \h </w:instrText>
+      </w:r>
+      <w:r>
+        <w:fldChar w:fldCharType="separate"/>
+      </w:r>
+      <w:r>
+        <w:t>3.4.3</w:t>
+      </w:r>
+      <w:r>
+        <w:fldChar w:fldCharType="end"/>
+      </w:r>
+      <w:r>
+        <w:t xml:space="preserve"> for more information on this file.</w:t>
+      </w:r>
+    </w:p>
+    <w:p>
+      <w:pPr>
+        <w:pStyle w:val="Heading4"/>
+      </w:pPr>
+      <w:proofErr w:type="spellStart"/>
+      <w:r>
+        <w:t>FullAwardsOutputFile</w:t>
+      </w:r>
+      <w:proofErr w:type="spellEnd"/>
+    </w:p>
+    <w:p>
+      <w:r>
+        <w:t xml:space="preserve">Default: </w:t>
+      </w:r>
+      <w:r>
+        <w:t>awards_full_listing.html</w:t>
+      </w:r>
+    </w:p>
+    <w:p>
+      <w:r>
+        <w:t xml:space="preserve">This </w:t>
+      </w:r>
+      <w:r>
+        <w:t>specifies the name of a file containing a full listing of all awards parsed from the COH report, regardless of whether they are marked as purchased. If you turn off the settings to skip purchased awards, this file may not be useful. However, if you utilize those settings, this file can provide additional error checking. Removing the filename and leaving this field blank will turn off writing this file.</w:t>
+      </w:r>
+      <w:r>
+        <w:t xml:space="preserve"> See section </w:t>
+      </w:r>
+      <w:r>
+        <w:fldChar w:fldCharType="begin"/>
+      </w:r>
+      <w:r>
+        <w:instrText xml:space="preserve"> REF _Ref228631558 \r \h </w:instrText>
+      </w:r>
+      <w:r>
+        <w:fldChar w:fldCharType="separate"/>
+      </w:r>
+      <w:r>
+        <w:t>3.4.4</w:t>
+      </w:r>
+      <w:r>
+        <w:fldChar w:fldCharType="end"/>
+      </w:r>
+      <w:r>
+        <w:t xml:space="preserve"> for more information on this file.</w:t>
+      </w:r>
+    </w:p>
+    <w:p>
+      <w:pPr>
+        <w:pStyle w:val="Heading4"/>
+      </w:pPr>
+      <w:proofErr w:type="spellStart"/>
+      <w:r>
+        <w:t>MergeWithPreviousData</w:t>
+      </w:r>
+      <w:proofErr w:type="spellEnd"/>
+    </w:p>
+    <w:p>
+      <w:r>
+        <w:t xml:space="preserve">Default: </w:t>
+      </w:r>
+      <w:r>
+        <w:t>0</w:t>
+      </w:r>
+    </w:p>
+    <w:p>
+      <w:r>
+        <w:t xml:space="preserve">This should either be 1 or 0. </w:t>
+      </w:r>
+      <w:r>
+        <w:t>When it is 0, the remaining Settings fields (</w:t>
+      </w:r>
+      <w:r>
+        <w:t>PreviousDataFile</w:t>
+      </w:r>
+      <w:r>
+        <w:t xml:space="preserve">, </w:t>
+      </w:r>
+      <w:proofErr w:type="spellStart"/>
+      <w:r>
+        <w:t>NewAwardsCardsOutputFile</w:t>
+      </w:r>
+      <w:proofErr w:type="spellEnd"/>
+      <w:r>
+        <w:t xml:space="preserve">, and </w:t>
+      </w:r>
+      <w:proofErr w:type="spellStart"/>
+      <w:r>
+        <w:t>NewAwardsShoppingList</w:t>
+      </w:r>
+      <w:proofErr w:type="spellEnd"/>
+      <w:r>
+        <w:t xml:space="preserve">) are ignored. When it is set to 1, the input COH report file will be treated as new awards intended to be added to an existing COH report previously parsed. See section </w:t>
+      </w:r>
+      <w:r>
+        <w:fldChar w:fldCharType="begin"/>
+      </w:r>
+      <w:r>
+        <w:instrText xml:space="preserve"> REF _Ref228486692 \r \h </w:instrText>
+      </w:r>
+      <w:r>
+        <w:fldChar w:fldCharType="separate"/>
+      </w:r>
+      <w:r>
+        <w:t>3.6</w:t>
+      </w:r>
+      <w:r>
+        <w:fldChar w:fldCharType="end"/>
+      </w:r>
+      <w:r>
+        <w:t xml:space="preserve"> for more information on using this feature.</w:t>
+      </w:r>
+    </w:p>
+    <w:p>
+      <w:pPr>
+        <w:pStyle w:val="Heading4"/>
+      </w:pPr>
+      <w:r>
+        <w:t>PreviousDataFile</w:t>
+      </w:r>
+    </w:p>
+    <w:p>
+      <w:r>
+        <w:t xml:space="preserve">Default: </w:t>
+      </w:r>
+    </w:p>
+    <w:p>
+      <w:r>
+        <w:t xml:space="preserve">This </w:t>
+      </w:r>
+      <w:r>
+        <w:t xml:space="preserve">is only used when </w:t>
+      </w:r>
+      <w:proofErr w:type="spellStart"/>
+      <w:r>
+        <w:t>MergeWithPreviousData</w:t>
+      </w:r>
+      <w:proofErr w:type="spellEnd"/>
+      <w:r>
+        <w:t xml:space="preserve"> is set to 1. This field specifies the binary data file of the existing parsed awards set with which to merge the new COH report. The binary </w:t>
+      </w:r>
+      <w:proofErr w:type="spellStart"/>
+      <w:r>
+        <w:t>pkl</w:t>
+      </w:r>
+      <w:proofErr w:type="spellEnd"/>
+      <w:r>
+        <w:t xml:space="preserve"> data files written by the program have names containing a time-stamp, so when this field is left blank, the program will search the directory for the </w:t>
+      </w:r>
+      <w:proofErr w:type="spellStart"/>
+      <w:r>
+        <w:t>pkl</w:t>
+      </w:r>
+      <w:proofErr w:type="spellEnd"/>
+      <w:r>
+        <w:t xml:space="preserve"> filename with the most recent time-stamp. If a specific file is desired (for example, if </w:t>
+      </w:r>
+      <w:proofErr w:type="gramStart"/>
+      <w:r>
+        <w:t>an</w:t>
+      </w:r>
+      <w:proofErr w:type="gramEnd"/>
+      <w:r>
+        <w:t xml:space="preserve"> merge was done incorrectly and needs to be </w:t>
+      </w:r>
+      <w:r>
+        <w:t>attempted</w:t>
+      </w:r>
+      <w:r>
+        <w:t xml:space="preserve"> again</w:t>
+      </w:r>
+      <w:r>
+        <w:t xml:space="preserve"> with revised parser settings</w:t>
+      </w:r>
+      <w:r>
+        <w:t>)</w:t>
+      </w:r>
+      <w:r>
+        <w:t xml:space="preserve">, its name may be entered for this field. </w:t>
+      </w:r>
+      <w:r>
+        <w:t xml:space="preserve">See section </w:t>
+      </w:r>
+      <w:r>
+        <w:fldChar w:fldCharType="begin"/>
+      </w:r>
+      <w:r>
+        <w:instrText xml:space="preserve"> REF _Ref228486692 \r \h </w:instrText>
+      </w:r>
+      <w:r>
+        <w:fldChar w:fldCharType="separate"/>
+      </w:r>
+      <w:r>
+        <w:t>3.6</w:t>
+      </w:r>
+      <w:r>
+        <w:fldChar w:fldCharType="end"/>
+      </w:r>
+      <w:r>
+        <w:t xml:space="preserve"> for more information on using this feature.</w:t>
+      </w:r>
+    </w:p>
+    <w:p>
+      <w:pPr>
+        <w:pStyle w:val="Heading4"/>
+      </w:pPr>
+      <w:proofErr w:type="spellStart"/>
+      <w:r>
+        <w:t>NewAwardsCardsOutputFile</w:t>
+      </w:r>
+      <w:proofErr w:type="spellEnd"/>
+    </w:p>
+    <w:p>
+      <w:r>
+        <w:t xml:space="preserve">Default: </w:t>
+      </w:r>
+    </w:p>
+    <w:p>
+      <w:r>
+        <w:t xml:space="preserve">This is only used when </w:t>
+      </w:r>
+      <w:proofErr w:type="spellStart"/>
+      <w:r>
+        <w:t>MergeWithPreviousData</w:t>
+      </w:r>
+      <w:proofErr w:type="spellEnd"/>
+      <w:r>
+        <w:t xml:space="preserve"> is set to 1. This field specifies </w:t>
+      </w:r>
+      <w:r>
+        <w:t>an optional output file with awards cards from new awards only (awards from the new input file but not from earlier data). This file would be in the same format as the standard Awards Cards output file, and is primarily used for verifying accurate parsing of the new awards</w:t>
+      </w:r>
+      <w:r>
+        <w:t xml:space="preserve">. The standard Awards Cards file will also be written and will contain the awards from the earlier COH report in </w:t>
+      </w:r>
+      <w:r>
+        <w:lastRenderedPageBreak/>
+        <w:t>addition to the new awards from this report</w:t>
+      </w:r>
+      <w:r>
+        <w:t>. Leaving this field blank will direct the parser program to skip writing this output file.</w:t>
+      </w:r>
+    </w:p>
+    <w:p>
+      <w:pPr>
+        <w:pStyle w:val="Heading4"/>
+      </w:pPr>
+      <w:proofErr w:type="spellStart"/>
+      <w:r>
+        <w:t>NewAwardsShoppingList</w:t>
+      </w:r>
+      <w:proofErr w:type="spellEnd"/>
+    </w:p>
+    <w:p>
+      <w:r>
+        <w:t xml:space="preserve">Default: </w:t>
+      </w:r>
+    </w:p>
+    <w:p>
+      <w:r>
+        <w:t xml:space="preserve">This is only used when </w:t>
+      </w:r>
+      <w:proofErr w:type="spellStart"/>
+      <w:r>
+        <w:t>MergeWithPreviousData</w:t>
+      </w:r>
+      <w:proofErr w:type="spellEnd"/>
+      <w:r>
+        <w:t xml:space="preserve"> is set to 1. This field specifies an optional output </w:t>
+      </w:r>
+      <w:r>
+        <w:t>shopping list file for the</w:t>
+      </w:r>
+      <w:r>
+        <w:t xml:space="preserve"> new awards only (awards from the new input file but not from earlier data). </w:t>
+      </w:r>
+      <w:r>
+        <w:t>This allows you to compare the parsed results with the TLC Shopping List. A new standard shopping list file (containing awards from the initial report plus this new report) will also be written, which is useful for updating Awards Inventory sheets</w:t>
+      </w:r>
+      <w:r>
+        <w:t>. Leaving this field blank will direct the parser program to skip writing this output file.</w:t>
+      </w:r>
+    </w:p>
+    <w:p>
+      <w:pPr>
+        <w:pStyle w:val="Heading3"/>
+      </w:pPr>
+      <w:proofErr w:type="spellStart"/>
+      <w:r>
+        <w:t>DYOBadges</w:t>
+      </w:r>
+      <w:proofErr w:type="spellEnd"/>
+      <w:r>
+        <w:t xml:space="preserve"> Options</w:t>
+      </w:r>
+    </w:p>
+    <w:p>
+      <w:r>
+        <w:t xml:space="preserve">This is an optional group. If no DYO/TEAM </w:t>
+      </w:r>
+      <w:r>
+        <w:t xml:space="preserve">elective </w:t>
+      </w:r>
+      <w:r>
+        <w:t>badges are present, the parser program will write two example entries with award dates set to 01/01/2001 (prior to Trail Life’s formation) to clearly demonstrate the format of this section.</w:t>
+      </w:r>
+    </w:p>
+    <w:p>
+      <w:r>
+        <w:t xml:space="preserve">It is not necessary to create this section prior to running the parser program. If </w:t>
+      </w:r>
+      <w:r>
+        <w:t xml:space="preserve">DYO/TEAM badges are detected in the COH report, the program will prompt you for the badge name. That data will then be written to the settings file and will be available should you need to parse a revised COH report file. However, manually specifying entries to this section may be useful, particularly if a large group of </w:t>
+      </w:r>
+      <w:proofErr w:type="spellStart"/>
+      <w:r>
+        <w:t>Trailmen</w:t>
+      </w:r>
+      <w:proofErr w:type="spellEnd"/>
+      <w:r>
+        <w:t xml:space="preserve"> all complete a TEAM badge and you prefer to not re-enter the same badge name multiple times.</w:t>
+      </w:r>
+    </w:p>
+    <w:p>
+      <w:r>
+        <w:t xml:space="preserve">In this section, a subsection designated by a </w:t>
+      </w:r>
+      <w:r>
+        <w:t>&lt;Badge&gt;</w:t>
+      </w:r>
+      <w:r>
+        <w:t xml:space="preserve"> … </w:t>
+      </w:r>
+      <w:r>
+        <w:t>&lt;/Badge&gt;</w:t>
+      </w:r>
+      <w:r>
+        <w:t xml:space="preserve"> set of tags designates a single custom badge. Each Badge subsection must contain three fields: </w:t>
+      </w:r>
+      <w:proofErr w:type="spellStart"/>
+      <w:r>
+        <w:t>Trailman</w:t>
+      </w:r>
+      <w:proofErr w:type="spellEnd"/>
+      <w:r>
+        <w:t xml:space="preserve">, </w:t>
+      </w:r>
+      <w:proofErr w:type="spellStart"/>
+      <w:r>
+        <w:t>CompletedDate</w:t>
+      </w:r>
+      <w:proofErr w:type="spellEnd"/>
+      <w:r>
+        <w:t xml:space="preserve">, and </w:t>
+      </w:r>
+      <w:proofErr w:type="spellStart"/>
+      <w:r>
+        <w:t>BadgeName</w:t>
+      </w:r>
+      <w:proofErr w:type="spellEnd"/>
+      <w:r>
+        <w:t xml:space="preserve">. If </w:t>
+      </w:r>
+      <w:proofErr w:type="spellStart"/>
+      <w:r>
+        <w:t>a</w:t>
+      </w:r>
+      <w:proofErr w:type="spellEnd"/>
+      <w:r>
+        <w:t xml:space="preserve"> custom elective award is found in the COH report</w:t>
+      </w:r>
+      <w:r>
+        <w:t xml:space="preserve">, the parser program will check to see if any </w:t>
+      </w:r>
+      <w:proofErr w:type="spellStart"/>
+      <w:r>
+        <w:t>DYOBadges</w:t>
+      </w:r>
+      <w:proofErr w:type="spellEnd"/>
+      <w:r>
+        <w:t xml:space="preserve"> entries have a </w:t>
+      </w:r>
+      <w:proofErr w:type="spellStart"/>
+      <w:r>
+        <w:t>Trailman</w:t>
+      </w:r>
+      <w:proofErr w:type="spellEnd"/>
+      <w:r>
+        <w:t xml:space="preserve"> and </w:t>
+      </w:r>
+      <w:proofErr w:type="spellStart"/>
+      <w:r>
+        <w:t>CompletedDate</w:t>
+      </w:r>
+      <w:proofErr w:type="spellEnd"/>
+      <w:r>
+        <w:t xml:space="preserve"> that match the </w:t>
+      </w:r>
+      <w:proofErr w:type="spellStart"/>
+      <w:r>
+        <w:t>Trailman</w:t>
+      </w:r>
+      <w:proofErr w:type="spellEnd"/>
+      <w:r>
+        <w:t xml:space="preserve"> name and award completion date in the report. If both match, the specified </w:t>
+      </w:r>
+      <w:proofErr w:type="spellStart"/>
+      <w:r>
+        <w:t>BadgeName</w:t>
+      </w:r>
+      <w:proofErr w:type="spellEnd"/>
+      <w:r>
+        <w:t xml:space="preserve"> will be assigned as the name of the elective badge.</w:t>
+      </w:r>
+    </w:p>
+    <w:p>
+      <w:pPr>
+        <w:pStyle w:val="Heading4"/>
+      </w:pPr>
+      <w:proofErr w:type="spellStart"/>
+      <w:r>
+        <w:t>Trailman</w:t>
+      </w:r>
+      <w:proofErr w:type="spellEnd"/>
+    </w:p>
+    <w:p>
+      <w:r>
+        <w:t xml:space="preserve">This is the name of the </w:t>
+      </w:r>
+      <w:proofErr w:type="spellStart"/>
+      <w:r>
+        <w:t>Trailman</w:t>
+      </w:r>
+      <w:proofErr w:type="spellEnd"/>
+      <w:r>
+        <w:t xml:space="preserve"> earning the custom elective badge. This name must be the same as the name in the TLC COH report, except that it is in FirstName LastName format (e.g. the name should be “John Smith” in the settings file to match with a TLC entry for “Smith, John”).</w:t>
+      </w:r>
+    </w:p>
+    <w:p>
+      <w:pPr>
+        <w:pStyle w:val="Heading4"/>
+      </w:pPr>
+      <w:proofErr w:type="spellStart"/>
+      <w:r>
+        <w:t>CompletedDate</w:t>
+      </w:r>
+      <w:proofErr w:type="spellEnd"/>
+    </w:p>
+    <w:p>
+      <w:r>
+        <w:t xml:space="preserve">This </w:t>
+      </w:r>
+      <w:r>
+        <w:t>is the date listed in TLC as the Completion Date of the specified elective award. It should be in MM/DD/YYYY format.</w:t>
+      </w:r>
+    </w:p>
+    <w:p>
+      <w:pPr>
+        <w:pStyle w:val="Heading4"/>
+      </w:pPr>
+      <w:proofErr w:type="spellStart"/>
+      <w:r>
+        <w:lastRenderedPageBreak/>
+        <w:t>BadgeName</w:t>
+      </w:r>
+      <w:proofErr w:type="spellEnd"/>
+    </w:p>
+    <w:p>
+      <w:r>
+        <w:t>This is the name to be assigned to the matching DYO/TEAM badge.</w:t>
+      </w:r>
+    </w:p>
+    <w:p>
+      <w:pPr>
+        <w:pStyle w:val="Heading2"/>
+      </w:pPr>
+      <w:bookmarkStart w:id="10" w:name="_Ref228486692"/>
+      <w:r>
+        <w:t>Combining Multiple COH Reports</w:t>
+      </w:r>
+      <w:bookmarkEnd w:id="10"/>
+    </w:p>
+    <w:p>
+      <w:r>
+        <w:t xml:space="preserve">The parser program has the ability to combine successive COH reports into a single awards program and set of awards cards. Ideally, this feature need not be utilized frequently. However, if you pull an initial set of awards and start preparing them, only have other leaders add some missing awards last-minute, it may be a useful feature. However, this functionality relies on the “purchased” designation, so it is necessary to use that designation as outlined in section </w:t>
+      </w:r>
+      <w:r>
+        <w:fldChar w:fldCharType="begin"/>
+      </w:r>
+      <w:r>
+        <w:instrText xml:space="preserve"> REF _Ref228634914 \r \h </w:instrText>
+      </w:r>
+      <w:r>
+        <w:fldChar w:fldCharType="separate"/>
+      </w:r>
+      <w:r>
+        <w:t>3.3</w:t>
+      </w:r>
+      <w:r>
+        <w:fldChar w:fldCharType="end"/>
+      </w:r>
+      <w:r>
+        <w:t>.</w:t>
+      </w:r>
+      <w:r>
+        <w:t xml:space="preserve"> If you do not mark awards as purchased as soon as they are parsed into the awards program, you can simply re-run the program with the new COH report. However, if you marked awards in TLC as purchased immediately after saving and parsing a COH report, you can use this merge capability.</w:t>
+      </w:r>
+    </w:p>
+    <w:p>
+      <w:r>
+        <w:t>The merge process is as follows:</w:t>
+      </w:r>
+    </w:p>
+    <w:p>
+      <w:pPr>
+        <w:pStyle w:val="ListParagraph"/>
+        <w:numPr>
+          <w:ilvl w:val="0"/>
+          <w:numId w:val="3"/>
+        </w:numPr>
+      </w:pPr>
+      <w:r>
+        <w:t>Save the original COH awards report (this would have been completed at an earlier date).</w:t>
+      </w:r>
+    </w:p>
+    <w:p>
+      <w:pPr>
+        <w:pStyle w:val="ListParagraph"/>
+        <w:numPr>
+          <w:ilvl w:val="0"/>
+          <w:numId w:val="3"/>
+        </w:numPr>
+      </w:pPr>
+      <w:r>
+        <w:t>Mark the original awards as purchased in TCL</w:t>
+      </w:r>
+      <w:r>
+        <w:t xml:space="preserve"> </w:t>
+      </w:r>
+      <w:r>
+        <w:t>report (this would have been completed at an earlier date).</w:t>
+      </w:r>
+    </w:p>
+    <w:p>
+      <w:pPr>
+        <w:pStyle w:val="ListParagraph"/>
+        <w:numPr>
+          <w:ilvl w:val="0"/>
+          <w:numId w:val="3"/>
+        </w:numPr>
+      </w:pPr>
+      <w:r>
+        <w:t>In TLC, go to the Court of Honor Report page and save it as an HTML file in the same directory as your original report. Make sure to select a different file name (such as “AdditionalAwards.htm”).</w:t>
+      </w:r>
+    </w:p>
+    <w:p>
+      <w:pPr>
+        <w:pStyle w:val="ListParagraph"/>
+        <w:numPr>
+          <w:ilvl w:val="0"/>
+          <w:numId w:val="3"/>
+        </w:numPr>
+      </w:pPr>
+      <w:r>
+        <w:t xml:space="preserve">Edit the TL_Awards_Parser_settings.xml file in the directory and set both </w:t>
+      </w:r>
+      <w:proofErr w:type="spellStart"/>
+      <w:r>
+        <w:t>SkipPurchasedAwards</w:t>
+      </w:r>
+      <w:proofErr w:type="spellEnd"/>
+      <w:r>
+        <w:t xml:space="preserve"> and </w:t>
+      </w:r>
+      <w:proofErr w:type="spellStart"/>
+      <w:r>
+        <w:t>SkipPurchasedRanks</w:t>
+      </w:r>
+      <w:proofErr w:type="spellEnd"/>
+      <w:r>
+        <w:t xml:space="preserve"> to 1 so that the original set of awards do not get mixed in with the new set. Also set </w:t>
+      </w:r>
+      <w:proofErr w:type="spellStart"/>
+      <w:r>
+        <w:t>MergeWithPreviousData</w:t>
+      </w:r>
+      <w:proofErr w:type="spellEnd"/>
+      <w:r>
+        <w:t xml:space="preserve"> to 1 to force the parser program to merge the new file with existing data.</w:t>
+      </w:r>
+    </w:p>
+    <w:p>
+      <w:pPr>
+        <w:pStyle w:val="ListParagraph"/>
+        <w:numPr>
+          <w:ilvl w:val="0"/>
+          <w:numId w:val="3"/>
+        </w:numPr>
+      </w:pPr>
+      <w:r>
+        <w:t xml:space="preserve">Optionally set the </w:t>
+      </w:r>
+      <w:r>
+        <w:t>PreviousDataFile</w:t>
+      </w:r>
+      <w:r>
+        <w:t xml:space="preserve">, </w:t>
+      </w:r>
+      <w:proofErr w:type="spellStart"/>
+      <w:r>
+        <w:t>NewAwardsCardsOutputFile</w:t>
+      </w:r>
+      <w:proofErr w:type="spellEnd"/>
+      <w:r>
+        <w:t xml:space="preserve">, and </w:t>
+      </w:r>
+      <w:proofErr w:type="spellStart"/>
+      <w:r>
+        <w:t>NewAwardsShoppingList</w:t>
+      </w:r>
+      <w:proofErr w:type="spellEnd"/>
+      <w:r>
+        <w:t xml:space="preserve"> fields </w:t>
+      </w:r>
+      <w:r>
+        <w:t xml:space="preserve">as needed </w:t>
+      </w:r>
+      <w:r>
+        <w:t xml:space="preserve">(see description of each in section </w:t>
+      </w:r>
+      <w:r>
+        <w:fldChar w:fldCharType="begin"/>
+      </w:r>
+      <w:r>
+        <w:instrText xml:space="preserve"> REF _Ref228635578 \r \h </w:instrText>
+      </w:r>
+      <w:r>
+        <w:fldChar w:fldCharType="separate"/>
+      </w:r>
+      <w:r>
+        <w:t>3.5.1</w:t>
+      </w:r>
+      <w:r>
+        <w:fldChar w:fldCharType="end"/>
+      </w:r>
+      <w:r>
+        <w:t>)</w:t>
+      </w:r>
+      <w:r>
+        <w:t>.</w:t>
+      </w:r>
+    </w:p>
+    <w:p>
+      <w:pPr>
+        <w:pStyle w:val="ListParagraph"/>
+        <w:numPr>
+          <w:ilvl w:val="0"/>
+          <w:numId w:val="3"/>
+        </w:numPr>
+      </w:pPr>
+      <w:r>
+        <w:t xml:space="preserve">Optionally update </w:t>
+      </w:r>
+      <w:proofErr w:type="spellStart"/>
+      <w:r>
+        <w:t>AwardsCardsOutputFile</w:t>
+      </w:r>
+      <w:proofErr w:type="spellEnd"/>
+      <w:r>
+        <w:t xml:space="preserve">, </w:t>
+      </w:r>
+      <w:proofErr w:type="spellStart"/>
+      <w:r>
+        <w:t>AwardsProgramOutputFile</w:t>
+      </w:r>
+      <w:proofErr w:type="spellEnd"/>
+      <w:r>
+        <w:t xml:space="preserve">, and </w:t>
+      </w:r>
+      <w:proofErr w:type="spellStart"/>
+      <w:r>
+        <w:t>FullAwardsOutputFile</w:t>
+      </w:r>
+      <w:proofErr w:type="spellEnd"/>
+      <w:r>
+        <w:t xml:space="preserve"> fields to avoid overwriting those files (or move those files to a different location on your computer if you wish to retain the original set).</w:t>
+      </w:r>
+    </w:p>
+    <w:p>
+      <w:pPr>
+        <w:pStyle w:val="ListParagraph"/>
+        <w:numPr>
+          <w:ilvl w:val="0"/>
+          <w:numId w:val="3"/>
+        </w:numPr>
+      </w:pPr>
+      <w:r>
+        <w:t>Run the parser program and select the new COH report file.</w:t>
+      </w:r>
+    </w:p>
+    <w:p>
+      <w:pPr>
+        <w:pStyle w:val="ListParagraph"/>
+        <w:numPr>
+          <w:ilvl w:val="0"/>
+          <w:numId w:val="3"/>
+        </w:numPr>
+      </w:pPr>
+      <w:r>
+        <w:t xml:space="preserve">The program will generate a full set of new files. The files specified by </w:t>
+      </w:r>
+      <w:proofErr w:type="spellStart"/>
+      <w:r>
+        <w:t>AwardsCardsOutputFile</w:t>
+      </w:r>
+      <w:proofErr w:type="spellEnd"/>
+      <w:r>
+        <w:t xml:space="preserve">, </w:t>
+      </w:r>
+      <w:proofErr w:type="spellStart"/>
+      <w:r>
+        <w:t>AwardsProgramOutputFile</w:t>
+      </w:r>
+      <w:proofErr w:type="spellEnd"/>
+      <w:r>
+        <w:t xml:space="preserve">, </w:t>
+      </w:r>
+      <w:proofErr w:type="spellStart"/>
+      <w:r>
+        <w:t>AwardsShoppingList</w:t>
+      </w:r>
+      <w:proofErr w:type="spellEnd"/>
+      <w:r>
+        <w:t xml:space="preserve">, and </w:t>
+      </w:r>
+      <w:proofErr w:type="spellStart"/>
+      <w:r>
+        <w:t>FullAwardsOutputFile</w:t>
+      </w:r>
+      <w:proofErr w:type="spellEnd"/>
+      <w:r>
+        <w:t xml:space="preserve"> will all contain merged data listing awards from both the original report and the new report. The files specified by </w:t>
+      </w:r>
+      <w:proofErr w:type="spellStart"/>
+      <w:r>
+        <w:t>NewAwardsCardsOutputFile</w:t>
+      </w:r>
+      <w:proofErr w:type="spellEnd"/>
+      <w:r>
+        <w:t xml:space="preserve"> and </w:t>
+      </w:r>
+      <w:proofErr w:type="spellStart"/>
+      <w:r>
+        <w:t>NewAwardsShoppingList</w:t>
+      </w:r>
+      <w:proofErr w:type="spellEnd"/>
+      <w:r>
+        <w:t xml:space="preserve"> will contain non-purchased awards from the new COH report only.</w:t>
+      </w:r>
+    </w:p>
+    <w:p>
+      <w:pPr>
+        <w:pStyle w:val="ListParagraph"/>
+        <w:numPr>
+          <w:ilvl w:val="0"/>
+          <w:numId w:val="3"/>
+        </w:numPr>
+      </w:pPr>
+      <w:r>
+        <w:lastRenderedPageBreak/>
+        <w:t>Verify that the new shopping list matches expectations and mark awards in TLC as purchased.</w:t>
+      </w:r>
+    </w:p>
+    <w:p>
+      <w:pPr>
+        <w:pStyle w:val="Heading1"/>
+      </w:pPr>
+      <w:bookmarkStart w:id="11" w:name="_Ref228626584"/>
+      <w:r>
+        <w:t>Awards Inventory Sheet</w:t>
+      </w:r>
+      <w:bookmarkEnd w:id="11"/>
+    </w:p>
+    <w:p>
+      <w:r>
+        <w:t xml:space="preserve">Our troop maintains an awards inventory. At a COH, we pull awards from inventory and then restock after the ceremony. This gives us the flexibility to purchase awards at convenient times (such as when sales or free shipping are offered, or when we have a discount coupon after rechartering). It also allows us to present awards (especially Navigator/Adventurer rank patches) as soon as they are earned rather than forcing the </w:t>
+      </w:r>
+      <w:proofErr w:type="spellStart"/>
+      <w:r>
+        <w:t>Trailman</w:t>
+      </w:r>
+      <w:proofErr w:type="spellEnd"/>
+      <w:r>
+        <w:t xml:space="preserve"> to wait until the COH to receive the awards.</w:t>
+      </w:r>
+      <w:r>
+        <w:t xml:space="preserve"> It also provides a source of extra awards, if any are lost or broken during the course of the year. The provided AwardsInventory.xlsx sheet is our means of tracking what is currently in inventory and how much we need to purchase to replenish it.</w:t>
+      </w:r>
+    </w:p>
+    <w:p>
+      <w:r>
+        <w:t>The sheet is color-coded to try to group awards of a similar level or type. Column C lists the target inventory level for each award. We currently target an inventory sufficient to cover expected awards for an entire program year so that we need only purchase awards once a year. Based on your own troop’s size and attendance levels, you can estimate what you expect to need.</w:t>
+      </w:r>
+    </w:p>
+    <w:p>
+      <w:r>
+        <w:t>Column E lists the current inventory level. While the process described below will allow you to update this column of data correctly after a COH, it is useful to periodically do a manual count of the inventory for verification. Column F lists the current award price from the Trail Life Store for each award. Note that some awards are purchased in quantities larger than 1, and this value is the computed price for a single award. Comments on the different cells indicate the assumed purchase quantity.</w:t>
+      </w:r>
+      <w:r>
+        <w:t xml:space="preserve"> The price data is used to compute the purchase price (Cell L92) and inventory value (Cell L93).</w:t>
+      </w:r>
+    </w:p>
+    <w:p>
+      <w:r>
+        <w:t>The awards parser program generates a shopping list containing all awards not already marked as “purchased” in TLC.</w:t>
+      </w:r>
+      <w:r>
+        <w:t xml:space="preserve"> The data in that report is formatted identically to the inventory sheet and Column D from the shopping list output file can be copied directly to Column H of the inventory sheet.</w:t>
+      </w:r>
+    </w:p>
+    <w:p>
+      <w:r>
+        <w:t>To use the remaining columns, start by turning on either “Calculate new totals”, “Calculate purchases”, or both in Cells R2 and R3 respectively. Set these values to 1 to turn on corresponding calculations.</w:t>
+      </w:r>
+    </w:p>
+    <w:p>
+      <w:r>
+        <w:t xml:space="preserve">When “Calculate purchases” (Cell R3) is set to 1, Column I will be populated with suggested purchase quantities. This value is given by (Column C – (Column E – Column H)). In other words, it assumes the “To Award” quantities are taken out of the current awards quantity, and the suggested purchase is the number of awards needed to restore levels back to the target value. </w:t>
+      </w:r>
+      <w:r>
+        <w:lastRenderedPageBreak/>
+        <w:t>You should manually populate Column J with the actual amount purchased. This is especially necessary for any awards that are purchased in quantities other than 1. Column L will list the purchase price assuming a unit price in Column F and a purchase quantity in Column J, if populated, or Column I if J is empty.</w:t>
+      </w:r>
+    </w:p>
+    <w:p>
+      <w:r>
+        <w:t xml:space="preserve">If “Compute new totals” (Cell R2) is set to 1, Column K will be populated with a new inventory level. This is given by (Column E – Column H + Column J). It takes the current awards quantity, subtracts out the number of awards handed out, and then adds back in the actual submitted purchase. Note that the recommended purchase amount does not </w:t>
+      </w:r>
+      <w:r>
+        <w:t>factor into the updated total. It only uses the actual submitted purchase (Column J).</w:t>
+      </w:r>
+    </w:p>
+    <w:p>
+      <w:r>
+        <w:t xml:space="preserve">After a COH, copy the </w:t>
+      </w:r>
+      <w:proofErr w:type="gramStart"/>
+      <w:r>
+        <w:t>handed out</w:t>
+      </w:r>
+      <w:proofErr w:type="gramEnd"/>
+      <w:r>
+        <w:t xml:space="preserve"> awards to Column H of your inventory sheet. You may need to manually update some of the cells. For example, the parser does not know if a Worthy Life recipient received only a cross or if he also received the ribbon (“Worthy Life Award” in the sheet). Set R3 to 1 to suggest purchase quantities, and then populate Column J with the number of awards that are ordered. Set R2 to 1</w:t>
+      </w:r>
+      <w:r>
+        <w:t>, and then select Cells K3-K90. Right click and select copy (or press Ctrl-C). Right click on Cell E3 and select the “Paste Values” option. This will transfer the updated inventory quantity to Column E.</w:t>
+      </w:r>
+    </w:p>
+    <w:p>
+      <w:pPr>
+        <w:pStyle w:val="Heading1"/>
+      </w:pPr>
+      <w:r>
+        <w:t>Version Information</w:t>
+      </w:r>
+    </w:p>
+    <w:p>
+      <w:r>
+        <w:t xml:space="preserve">These tools were created and are maintained by Jeremiah Brown, </w:t>
+      </w:r>
+      <w:proofErr w:type="spellStart"/>
+      <w:r>
+        <w:t>Troopmaster</w:t>
+      </w:r>
+      <w:proofErr w:type="spellEnd"/>
+      <w:r>
+        <w:t xml:space="preserve"> AL-1613. Please submit feature requests and bug reports through the Git Hub page at </w:t>
+      </w:r>
+      <w:hyperlink r:id="rId8" w:history="1">
+        <w:r>
+          <w:rPr>
+            <w:rStyle w:val="Hyperlink"/>
+          </w:rPr>
+          <w:t>https://github.com/JeremiahDBrown/TLCAwardsParser/issues</w:t>
+        </w:r>
+      </w:hyperlink>
+    </w:p>
     <w:p/>
     <w:p>
-      <w:pPr>
-        <w:pStyle w:val="Heading2"/>
-      </w:pPr>
-      <w:bookmarkStart w:id="2" w:name="_Ref228486710"/>
-      <w:r>
-        <w:t>Parser Settings</w:t>
-      </w:r>
-      <w:bookmarkEnd w:id="2"/>
-    </w:p>
-    <w:p/>
-    <w:p>
-      <w:pPr>
-        <w:pStyle w:val="Heading2"/>
-      </w:pPr>
-      <w:bookmarkStart w:id="3" w:name="_Ref228486692"/>
-      <w:r>
-        <w:t>Combining Multiple COH Reports</w:t>
-      </w:r>
-      <w:bookmarkEnd w:id="3"/>
-    </w:p>
-    <w:p/>
+      <w:r>
+        <w:t>Version 0.4 – Release Date 02 May 2026</w:t>
+      </w:r>
+    </w:p>
+    <w:p>
+      <w:r>
+        <w:t>Initial public release</w:t>
+      </w:r>
+    </w:p>
     <w:sectPr>
       <w:pgSz w:w="12240" w:h="15840"/>
       <w:pgMar w:top="1440" w:right="1440" w:bottom="1440" w:left="1440" w:header="720" w:footer="720" w:gutter="0"/>
@@ -929,8 +2724,213 @@
       </w:rPr>
     </w:lvl>
   </w:abstractNum>
+  <w:abstractNum w:abstractNumId="1" w15:restartNumberingAfterBreak="0">
+    <w:nsid w:val="589C138F"/>
+    <w:multiLevelType w:val="hybridMultilevel"/>
+    <w:tmpl w:val="28C0C62A"/>
+    <w:lvl w:ilvl="0" w:tplc="0409000F">
+      <w:start w:val="1"/>
+      <w:numFmt w:val="decimal"/>
+      <w:lvlText w:val="%1."/>
+      <w:lvlJc w:val="left"/>
+      <w:pPr>
+        <w:ind w:left="720" w:hanging="360"/>
+      </w:pPr>
+    </w:lvl>
+    <w:lvl w:ilvl="1" w:tplc="04090019" w:tentative="1">
+      <w:start w:val="1"/>
+      <w:numFmt w:val="lowerLetter"/>
+      <w:lvlText w:val="%2."/>
+      <w:lvlJc w:val="left"/>
+      <w:pPr>
+        <w:ind w:left="1440" w:hanging="360"/>
+      </w:pPr>
+    </w:lvl>
+    <w:lvl w:ilvl="2" w:tplc="0409001B" w:tentative="1">
+      <w:start w:val="1"/>
+      <w:numFmt w:val="lowerRoman"/>
+      <w:lvlText w:val="%3."/>
+      <w:lvlJc w:val="right"/>
+      <w:pPr>
+        <w:ind w:left="2160" w:hanging="180"/>
+      </w:pPr>
+    </w:lvl>
+    <w:lvl w:ilvl="3" w:tplc="0409000F" w:tentative="1">
+      <w:start w:val="1"/>
+      <w:numFmt w:val="decimal"/>
+      <w:lvlText w:val="%4."/>
+      <w:lvlJc w:val="left"/>
+      <w:pPr>
+        <w:ind w:left="2880" w:hanging="360"/>
+      </w:pPr>
+    </w:lvl>
+    <w:lvl w:ilvl="4" w:tplc="04090019" w:tentative="1">
+      <w:start w:val="1"/>
+      <w:numFmt w:val="lowerLetter"/>
+      <w:lvlText w:val="%5."/>
+      <w:lvlJc w:val="left"/>
+      <w:pPr>
+        <w:ind w:left="3600" w:hanging="360"/>
+      </w:pPr>
+    </w:lvl>
+    <w:lvl w:ilvl="5" w:tplc="0409001B" w:tentative="1">
+      <w:start w:val="1"/>
+      <w:numFmt w:val="lowerRoman"/>
+      <w:lvlText w:val="%6."/>
+      <w:lvlJc w:val="right"/>
+      <w:pPr>
+        <w:ind w:left="4320" w:hanging="180"/>
+      </w:pPr>
+    </w:lvl>
+    <w:lvl w:ilvl="6" w:tplc="0409000F" w:tentative="1">
+      <w:start w:val="1"/>
+      <w:numFmt w:val="decimal"/>
+      <w:lvlText w:val="%7."/>
+      <w:lvlJc w:val="left"/>
+      <w:pPr>
+        <w:ind w:left="5040" w:hanging="360"/>
+      </w:pPr>
+    </w:lvl>
+    <w:lvl w:ilvl="7" w:tplc="04090019" w:tentative="1">
+      <w:start w:val="1"/>
+      <w:numFmt w:val="lowerLetter"/>
+      <w:lvlText w:val="%8."/>
+      <w:lvlJc w:val="left"/>
+      <w:pPr>
+        <w:ind w:left="5760" w:hanging="360"/>
+      </w:pPr>
+    </w:lvl>
+    <w:lvl w:ilvl="8" w:tplc="0409001B" w:tentative="1">
+      <w:start w:val="1"/>
+      <w:numFmt w:val="lowerRoman"/>
+      <w:lvlText w:val="%9."/>
+      <w:lvlJc w:val="right"/>
+      <w:pPr>
+        <w:ind w:left="6480" w:hanging="180"/>
+      </w:pPr>
+    </w:lvl>
+  </w:abstractNum>
+  <w:abstractNum w:abstractNumId="2" w15:restartNumberingAfterBreak="0">
+    <w:nsid w:val="658D18EE"/>
+    <w:multiLevelType w:val="hybridMultilevel"/>
+    <w:tmpl w:val="3740EF08"/>
+    <w:lvl w:ilvl="0" w:tplc="F620C2D0">
+      <w:start w:val="1"/>
+      <w:numFmt w:val="bullet"/>
+      <w:lvlText w:val=""/>
+      <w:lvlJc w:val="left"/>
+      <w:pPr>
+        <w:ind w:left="720" w:hanging="360"/>
+      </w:pPr>
+      <w:rPr>
+        <w:rFonts w:ascii="Symbol" w:eastAsiaTheme="minorHAnsi" w:hAnsi="Symbol" w:cstheme="minorBidi" w:hint="default"/>
+      </w:rPr>
+    </w:lvl>
+    <w:lvl w:ilvl="1" w:tplc="04090003" w:tentative="1">
+      <w:start w:val="1"/>
+      <w:numFmt w:val="bullet"/>
+      <w:lvlText w:val="o"/>
+      <w:lvlJc w:val="left"/>
+      <w:pPr>
+        <w:ind w:left="1440" w:hanging="360"/>
+      </w:pPr>
+      <w:rPr>
+        <w:rFonts w:ascii="Courier New" w:hAnsi="Courier New" w:cs="Courier New" w:hint="default"/>
+      </w:rPr>
+    </w:lvl>
+    <w:lvl w:ilvl="2" w:tplc="04090005" w:tentative="1">
+      <w:start w:val="1"/>
+      <w:numFmt w:val="bullet"/>
+      <w:lvlText w:val=""/>
+      <w:lvlJc w:val="left"/>
+      <w:pPr>
+        <w:ind w:left="2160" w:hanging="360"/>
+      </w:pPr>
+      <w:rPr>
+        <w:rFonts w:ascii="Wingdings" w:hAnsi="Wingdings" w:hint="default"/>
+      </w:rPr>
+    </w:lvl>
+    <w:lvl w:ilvl="3" w:tplc="04090001" w:tentative="1">
+      <w:start w:val="1"/>
+      <w:numFmt w:val="bullet"/>
+      <w:lvlText w:val=""/>
+      <w:lvlJc w:val="left"/>
+      <w:pPr>
+        <w:ind w:left="2880" w:hanging="360"/>
+      </w:pPr>
+      <w:rPr>
+        <w:rFonts w:ascii="Symbol" w:hAnsi="Symbol" w:hint="default"/>
+      </w:rPr>
+    </w:lvl>
+    <w:lvl w:ilvl="4" w:tplc="04090003" w:tentative="1">
+      <w:start w:val="1"/>
+      <w:numFmt w:val="bullet"/>
+      <w:lvlText w:val="o"/>
+      <w:lvlJc w:val="left"/>
+      <w:pPr>
+        <w:ind w:left="3600" w:hanging="360"/>
+      </w:pPr>
+      <w:rPr>
+        <w:rFonts w:ascii="Courier New" w:hAnsi="Courier New" w:cs="Courier New" w:hint="default"/>
+      </w:rPr>
+    </w:lvl>
+    <w:lvl w:ilvl="5" w:tplc="04090005" w:tentative="1">
+      <w:start w:val="1"/>
+      <w:numFmt w:val="bullet"/>
+      <w:lvlText w:val=""/>
+      <w:lvlJc w:val="left"/>
+      <w:pPr>
+        <w:ind w:left="4320" w:hanging="360"/>
+      </w:pPr>
+      <w:rPr>
+        <w:rFonts w:ascii="Wingdings" w:hAnsi="Wingdings" w:hint="default"/>
+      </w:rPr>
+    </w:lvl>
+    <w:lvl w:ilvl="6" w:tplc="04090001" w:tentative="1">
+      <w:start w:val="1"/>
+      <w:numFmt w:val="bullet"/>
+      <w:lvlText w:val=""/>
+      <w:lvlJc w:val="left"/>
+      <w:pPr>
+        <w:ind w:left="5040" w:hanging="360"/>
+      </w:pPr>
+      <w:rPr>
+        <w:rFonts w:ascii="Symbol" w:hAnsi="Symbol" w:hint="default"/>
+      </w:rPr>
+    </w:lvl>
+    <w:lvl w:ilvl="7" w:tplc="04090003" w:tentative="1">
+      <w:start w:val="1"/>
+      <w:numFmt w:val="bullet"/>
+      <w:lvlText w:val="o"/>
+      <w:lvlJc w:val="left"/>
+      <w:pPr>
+        <w:ind w:left="5760" w:hanging="360"/>
+      </w:pPr>
+      <w:rPr>
+        <w:rFonts w:ascii="Courier New" w:hAnsi="Courier New" w:cs="Courier New" w:hint="default"/>
+      </w:rPr>
+    </w:lvl>
+    <w:lvl w:ilvl="8" w:tplc="04090005" w:tentative="1">
+      <w:start w:val="1"/>
+      <w:numFmt w:val="bullet"/>
+      <w:lvlText w:val=""/>
+      <w:lvlJc w:val="left"/>
+      <w:pPr>
+        <w:ind w:left="6480" w:hanging="360"/>
+      </w:pPr>
+      <w:rPr>
+        <w:rFonts w:ascii="Wingdings" w:hAnsi="Wingdings" w:hint="default"/>
+      </w:rPr>
+    </w:lvl>
+  </w:abstractNum>
   <w:num w:numId="1" w16cid:durableId="512763476">
     <w:abstractNumId w:val="0"/>
+  </w:num>
+  <w:num w:numId="2" w16cid:durableId="336470644">
+    <w:abstractNumId w:val="2"/>
+  </w:num>
+  <w:num w:numId="3" w16cid:durableId="1064137657">
+    <w:abstractNumId w:val="1"/>
   </w:num>
 </w:numbering>
 </file>
@@ -1368,7 +3368,7 @@
     <w:uiPriority w:val="9"/>
     <w:unhideWhenUsed/>
     <w:qFormat/>
-    <w:rsid w:val="00FB086D"/>
+    <w:rsid w:val="0060129C"/>
     <w:pPr>
       <w:keepNext/>
       <w:keepLines/>
@@ -1377,6 +3377,7 @@
         <w:numId w:val="1"/>
       </w:numPr>
       <w:spacing w:before="160" w:after="80"/>
+      <w:ind w:left="0" w:firstLine="0"/>
       <w:outlineLvl w:val="1"/>
     </w:pPr>
     <w:rPr>
@@ -1392,10 +3393,9 @@
     <w:next w:val="Normal"/>
     <w:link w:val="Heading3Char"/>
     <w:uiPriority w:val="9"/>
-    <w:semiHidden/>
     <w:unhideWhenUsed/>
     <w:qFormat/>
-    <w:rsid w:val="00FB086D"/>
+    <w:rsid w:val="0060129C"/>
     <w:pPr>
       <w:keepNext/>
       <w:keepLines/>
@@ -1404,6 +3404,7 @@
         <w:numId w:val="1"/>
       </w:numPr>
       <w:spacing w:before="160" w:after="80"/>
+      <w:ind w:left="0" w:firstLine="0"/>
       <w:outlineLvl w:val="2"/>
     </w:pPr>
     <w:rPr>
@@ -1419,7 +3420,6 @@
     <w:next w:val="Normal"/>
     <w:link w:val="Heading4Char"/>
     <w:uiPriority w:val="9"/>
-    <w:semiHidden/>
     <w:unhideWhenUsed/>
     <w:qFormat/>
     <w:rsid w:val="00FB086D"/>
@@ -1590,7 +3590,7 @@
     <w:basedOn w:val="DefaultParagraphFont"/>
     <w:link w:val="Heading2"/>
     <w:uiPriority w:val="9"/>
-    <w:rsid w:val="00FB086D"/>
+    <w:rsid w:val="0060129C"/>
     <w:rPr>
       <w:rFonts w:asciiTheme="majorHAnsi" w:eastAsiaTheme="majorEastAsia" w:hAnsiTheme="majorHAnsi" w:cstheme="majorBidi"/>
       <w:color w:val="2F5496" w:themeColor="accent1" w:themeShade="BF"/>
@@ -1603,8 +3603,7 @@
     <w:basedOn w:val="DefaultParagraphFont"/>
     <w:link w:val="Heading3"/>
     <w:uiPriority w:val="9"/>
-    <w:semiHidden/>
-    <w:rsid w:val="00FB086D"/>
+    <w:rsid w:val="0060129C"/>
     <w:rPr>
       <w:rFonts w:eastAsiaTheme="majorEastAsia" w:cstheme="majorBidi"/>
       <w:color w:val="2F5496" w:themeColor="accent1" w:themeShade="BF"/>
@@ -1617,7 +3616,6 @@
     <w:basedOn w:val="DefaultParagraphFont"/>
     <w:link w:val="Heading4"/>
     <w:uiPriority w:val="9"/>
-    <w:semiHidden/>
     <w:rsid w:val="00FB086D"/>
     <w:rPr>
       <w:rFonts w:eastAsiaTheme="majorEastAsia" w:cstheme="majorBidi"/>
@@ -1891,6 +3889,29 @@
       <w:color w:val="44546A" w:themeColor="text2"/>
       <w:sz w:val="18"/>
       <w:szCs w:val="18"/>
+    </w:rPr>
+  </w:style>
+  <w:style w:type="character" w:styleId="Hyperlink">
+    <w:name w:val="Hyperlink"/>
+    <w:basedOn w:val="DefaultParagraphFont"/>
+    <w:uiPriority w:val="99"/>
+    <w:unhideWhenUsed/>
+    <w:rsid w:val="00415F36"/>
+    <w:rPr>
+      <w:color w:val="0563C1" w:themeColor="hyperlink"/>
+      <w:u w:val="single"/>
+    </w:rPr>
+  </w:style>
+  <w:style w:type="character" w:styleId="UnresolvedMention">
+    <w:name w:val="Unresolved Mention"/>
+    <w:basedOn w:val="DefaultParagraphFont"/>
+    <w:uiPriority w:val="99"/>
+    <w:semiHidden/>
+    <w:unhideWhenUsed/>
+    <w:rsid w:val="00415F36"/>
+    <w:rPr>
+      <w:color w:val="605E5C"/>
+      <w:shd w:val="clear" w:color="auto" w:fill="E1DFDD"/>
     </w:rPr>
   </w:style>
 </w:styles>

</xml_diff>